<commit_message>
Committing Task 1 and 4 pdf
</commit_message>
<xml_diff>
--- a/pdf.docx
+++ b/pdf.docx
@@ -1,7 +1,630 @@
 
 <file path=word/document.xml><?xml version="1.0" encoding="utf-8"?>
-<w:document xmlns:wpc="http://schemas.microsoft.com/office/word/2010/wordprocessingCanvas" xmlns:cx="http://schemas.microsoft.com/office/drawing/2014/chartex" xmlns:cx1="http://schemas.microsoft.com/office/drawing/2015/9/8/chartex" xmlns:cx2="http://schemas.microsoft.com/office/drawing/2015/10/21/chartex" xmlns:cx3="http://schemas.microsoft.com/office/drawing/2016/5/9/chartex" xmlns:cx4="http://schemas.microsoft.com/office/drawing/2016/5/10/chartex" xmlns:cx5="http://schemas.microsoft.com/office/drawing/2016/5/11/chartex" xmlns:cx6="http://schemas.microsoft.com/office/drawing/2016/5/12/chartex" xmlns:cx7="http://schemas.microsoft.com/office/drawing/2016/5/13/chartex" xmlns:cx8="http://schemas.microsoft.com/office/drawing/2016/5/14/chartex" xmlns:mc="http://schemas.openxmlformats.org/markup-compatibility/2006" xmlns:aink="http://schemas.microsoft.com/office/drawing/2016/ink" xmlns:am3d="http://schemas.microsoft.com/office/drawing/2017/model3d" xmlns:o="urn:schemas-microsoft-com:office:office" xmlns:oel="http://schemas.microsoft.com/office/2019/extlst" xmlns:r="http://schemas.openxmlformats.org/officeDocument/2006/relationships" xmlns:m="http://schemas.openxmlformats.org/officeDocument/2006/math" xmlns:v="urn:schemas-microsoft-com:vml" xmlns:wp14="http://schemas.microsoft.com/office/word/2010/wordprocessingDrawing" xmlns:wp="http://schemas.openxmlformats.org/drawingml/2006/wordprocessingDrawing" xmlns:w10="urn:schemas-microsoft-com:office:word" xmlns:w="http://schemas.openxmlformats.org/wordprocessingml/2006/main" xmlns:w14="http://schemas.microsoft.com/office/word/2010/wordml" xmlns:w15="http://schemas.microsoft.com/office/word/2012/wordml" xmlns:w16cex="http://schemas.microsoft.com/office/word/2018/wordml/cex" xmlns:w16cid="http://schemas.microsoft.com/office/word/2016/wordml/cid" xmlns:w16="http://schemas.microsoft.com/office/word/2018/wordml" xmlns:w16du="http://schemas.microsoft.com/office/word/2023/wordml/word16du" xmlns:w16sdtdh="http://schemas.microsoft.com/office/word/2020/wordml/sdtdatahash" xmlns:w16sdtfl="http://schemas.microsoft.com/office/word/2024/wordml/sdtformatlock" xmlns:w16se="http://schemas.microsoft.com/office/word/2015/wordml/symex" xmlns:wpg="http://schemas.microsoft.com/office/word/2010/wordprocessingGroup" xmlns:wpi="http://schemas.microsoft.com/office/word/2010/wordprocessingInk" xmlns:wne="http://schemas.microsoft.com/office/word/2006/wordml" xmlns:wps="http://schemas.microsoft.com/office/word/2010/wordprocessingShape" mc:Ignorable="w14 w15 w16se w16cid w16 w16cex w16sdtdh w16sdtfl w16du wp14">
+<w:document xmlns:wpc="http://schemas.microsoft.com/office/word/2010/wordprocessingCanvas" xmlns:cx="http://schemas.microsoft.com/office/drawing/2014/chartex" xmlns:mc="http://schemas.openxmlformats.org/markup-compatibility/2006" xmlns:o="urn:schemas-microsoft-com:office:office" xmlns:r="http://schemas.openxmlformats.org/officeDocument/2006/relationships" xmlns:m="http://schemas.openxmlformats.org/officeDocument/2006/math" xmlns:v="urn:schemas-microsoft-com:vml" xmlns:wp14="http://schemas.microsoft.com/office/word/2010/wordprocessingDrawing" xmlns:wp="http://schemas.openxmlformats.org/drawingml/2006/wordprocessingDrawing" xmlns:w10="urn:schemas-microsoft-com:office:word" xmlns:w="http://schemas.openxmlformats.org/wordprocessingml/2006/main" xmlns:w14="http://schemas.microsoft.com/office/word/2010/wordml" xmlns:w15="http://schemas.microsoft.com/office/word/2012/wordml" xmlns:w16se="http://schemas.microsoft.com/office/word/2015/wordml/symex" xmlns:wpg="http://schemas.microsoft.com/office/word/2010/wordprocessingGroup" xmlns:wpi="http://schemas.microsoft.com/office/word/2010/wordprocessingInk" xmlns:wne="http://schemas.microsoft.com/office/word/2006/wordml" xmlns:wps="http://schemas.microsoft.com/office/word/2010/wordprocessingShape" mc:Ignorable="w14 w15 w16se wp14">
   <w:body>
+    <w:p>
+      <w:pPr>
+        <w:rPr>
+          <w:lang w:val="en-ZA"/>
+        </w:rPr>
+      </w:pPr>
+      <w:r>
+        <w:rPr>
+          <w:lang w:val="en-ZA"/>
+        </w:rPr>
+        <w:t>Task 1</w:t>
+      </w:r>
+    </w:p>
+    <w:p>
+      <w:pPr>
+        <w:rPr>
+          <w:lang w:val="en-ZA"/>
+        </w:rPr>
+      </w:pPr>
+      <w:r>
+        <w:rPr>
+          <w:lang w:val="en-ZA"/>
+        </w:rPr>
+        <w:t xml:space="preserve">1.5 </w:t>
+      </w:r>
+    </w:p>
+    <w:p>
+      <w:pPr>
+        <w:rPr>
+          <w:lang w:val="en-ZA"/>
+        </w:rPr>
+      </w:pPr>
+      <w:r>
+        <w:rPr>
+          <w:lang w:val="en-ZA"/>
+        </w:rPr>
+        <w:t xml:space="preserve">A single </w:t>
+      </w:r>
+      <w:proofErr w:type="spellStart"/>
+      <w:proofErr w:type="gramStart"/>
+      <w:r>
+        <w:rPr>
+          <w:i/>
+          <w:lang w:val="en-ZA"/>
+        </w:rPr>
+        <w:t>createConnector</w:t>
+      </w:r>
+      <w:proofErr w:type="spellEnd"/>
+      <w:r>
+        <w:rPr>
+          <w:i/>
+          <w:lang w:val="en-ZA"/>
+        </w:rPr>
+        <w:t>(</w:t>
+      </w:r>
+      <w:proofErr w:type="gramEnd"/>
+      <w:r>
+        <w:rPr>
+          <w:i/>
+          <w:lang w:val="en-ZA"/>
+        </w:rPr>
+        <w:t>string kind)</w:t>
+      </w:r>
+      <w:r>
+        <w:rPr>
+          <w:lang w:val="en-ZA"/>
+        </w:rPr>
+        <w:t xml:space="preserve"> function with an if/else chain means the function has to know about every connector type that exists, and every time Kudu Freight </w:t>
+      </w:r>
+      <w:proofErr w:type="spellStart"/>
+      <w:r>
+        <w:rPr>
+          <w:lang w:val="en-ZA"/>
+        </w:rPr>
+        <w:t>onboards</w:t>
+      </w:r>
+      <w:proofErr w:type="spellEnd"/>
+      <w:r>
+        <w:rPr>
+          <w:lang w:val="en-ZA"/>
+        </w:rPr>
+        <w:t xml:space="preserve"> a new data source, a developer has to go back into that already-working function and add another branch. </w:t>
+      </w:r>
+      <w:r>
+        <w:rPr>
+          <w:lang w:val="en-ZA"/>
+        </w:rPr>
+        <w:t xml:space="preserve">That function is never closed it must be modified </w:t>
+      </w:r>
+      <w:r>
+        <w:rPr>
+          <w:lang w:val="en-ZA"/>
+        </w:rPr>
+        <w:t>for ev</w:t>
+      </w:r>
+      <w:r>
+        <w:rPr>
+          <w:lang w:val="en-ZA"/>
+        </w:rPr>
+        <w:t>ery new source, which is</w:t>
+      </w:r>
+      <w:r>
+        <w:rPr>
+          <w:lang w:val="en-ZA"/>
+        </w:rPr>
+        <w:t xml:space="preserve"> what the open</w:t>
+      </w:r>
+      <w:r>
+        <w:rPr>
+          <w:lang w:val="en-ZA"/>
+        </w:rPr>
+        <w:t>-closed principle warns against- the</w:t>
+      </w:r>
+      <w:r>
+        <w:rPr>
+          <w:lang w:val="en-ZA"/>
+        </w:rPr>
+        <w:t xml:space="preserve"> code should be open to extension but closed to modification.</w:t>
+      </w:r>
+    </w:p>
+    <w:p>
+      <w:pPr>
+        <w:rPr>
+          <w:lang w:val="en-ZA"/>
+        </w:rPr>
+      </w:pPr>
+      <w:r>
+        <w:rPr>
+          <w:lang w:val="en-ZA"/>
+        </w:rPr>
+        <w:t xml:space="preserve">The </w:t>
+      </w:r>
+      <w:r>
+        <w:rPr>
+          <w:lang w:val="en-ZA"/>
+        </w:rPr>
+        <w:t xml:space="preserve">Factory Method solves this by moving the decision into the type system instead of a conditional. </w:t>
+      </w:r>
+      <w:proofErr w:type="spellStart"/>
+      <w:r>
+        <w:rPr>
+          <w:i/>
+          <w:lang w:val="en-ZA"/>
+        </w:rPr>
+        <w:t>ConnectorFactory</w:t>
+      </w:r>
+      <w:proofErr w:type="spellEnd"/>
+      <w:r>
+        <w:rPr>
+          <w:lang w:val="en-ZA"/>
+        </w:rPr>
+        <w:t xml:space="preserve"> declares </w:t>
+      </w:r>
+      <w:proofErr w:type="spellStart"/>
+      <w:proofErr w:type="gramStart"/>
+      <w:r>
+        <w:rPr>
+          <w:i/>
+          <w:lang w:val="en-ZA"/>
+        </w:rPr>
+        <w:t>createConnector</w:t>
+      </w:r>
+      <w:proofErr w:type="spellEnd"/>
+      <w:r>
+        <w:rPr>
+          <w:i/>
+          <w:lang w:val="en-ZA"/>
+        </w:rPr>
+        <w:t>(</w:t>
+      </w:r>
+      <w:proofErr w:type="gramEnd"/>
+      <w:r>
+        <w:rPr>
+          <w:i/>
+          <w:lang w:val="en-ZA"/>
+        </w:rPr>
+        <w:t>)</w:t>
+      </w:r>
+      <w:r>
+        <w:rPr>
+          <w:lang w:val="en-ZA"/>
+        </w:rPr>
+        <w:t xml:space="preserve"> withou</w:t>
+      </w:r>
+      <w:r>
+        <w:rPr>
+          <w:lang w:val="en-ZA"/>
+        </w:rPr>
+        <w:t xml:space="preserve">t saying which class it returns, each concrete factory </w:t>
+      </w:r>
+      <w:r>
+        <w:rPr>
+          <w:lang w:val="en-ZA"/>
+        </w:rPr>
+        <w:t xml:space="preserve">overrides it to return its own matching connector. Adding a new source </w:t>
+      </w:r>
+      <w:r>
+        <w:rPr>
+          <w:lang w:val="en-ZA"/>
+        </w:rPr>
+        <w:t xml:space="preserve">means writing one new Connector, </w:t>
+      </w:r>
+      <w:proofErr w:type="spellStart"/>
+      <w:r>
+        <w:rPr>
+          <w:lang w:val="en-ZA"/>
+        </w:rPr>
+        <w:t>ConnectorFactory</w:t>
+      </w:r>
+      <w:proofErr w:type="spellEnd"/>
+      <w:r>
+        <w:rPr>
+          <w:lang w:val="en-ZA"/>
+        </w:rPr>
+        <w:t xml:space="preserve"> pair (new pair of files) </w:t>
+      </w:r>
+      <w:r>
+        <w:rPr>
+          <w:lang w:val="en-ZA"/>
+        </w:rPr>
+        <w:t xml:space="preserve">and touching nothing that already compiles and works. The rest of the program, which only ever holds </w:t>
+      </w:r>
+      <w:r>
+        <w:rPr>
+          <w:i/>
+          <w:lang w:val="en-ZA"/>
+        </w:rPr>
+        <w:t xml:space="preserve">a </w:t>
+      </w:r>
+      <w:proofErr w:type="spellStart"/>
+      <w:r>
+        <w:rPr>
+          <w:i/>
+          <w:lang w:val="en-ZA"/>
+        </w:rPr>
+        <w:t>ConnectorFactory</w:t>
+      </w:r>
+      <w:proofErr w:type="spellEnd"/>
+      <w:r>
+        <w:rPr>
+          <w:i/>
+          <w:lang w:val="en-ZA"/>
+        </w:rPr>
+        <w:t>*</w:t>
+      </w:r>
+      <w:r>
+        <w:rPr>
+          <w:lang w:val="en-ZA"/>
+        </w:rPr>
+        <w:t>, doesn't even need to be recompiled. Extension happens by adding a class, not editing an existing one.</w:t>
+      </w:r>
+    </w:p>
+    <w:p>
+      <w:pPr>
+        <w:rPr>
+          <w:lang w:val="en-ZA"/>
+        </w:rPr>
+      </w:pPr>
+      <w:r>
+        <w:rPr>
+          <w:lang w:val="en-ZA"/>
+        </w:rPr>
+        <w:t>1.6</w:t>
+      </w:r>
+    </w:p>
+    <w:tbl>
+      <w:tblPr>
+        <w:tblStyle w:val="PlainTable1"/>
+        <w:tblW w:w="0" w:type="auto"/>
+        <w:tblLook w:val="04A0" w:firstRow="1" w:lastRow="0" w:firstColumn="1" w:lastColumn="0" w:noHBand="0" w:noVBand="1"/>
+      </w:tblPr>
+      <w:tblGrid>
+        <w:gridCol w:w="2283"/>
+        <w:gridCol w:w="2153"/>
+        <w:gridCol w:w="4580"/>
+      </w:tblGrid>
+      <w:tr>
+        <w:trPr>
+          <w:cnfStyle w:val="100000000000" w:firstRow="1" w:lastRow="0" w:firstColumn="0" w:lastColumn="0" w:oddVBand="0" w:evenVBand="0" w:oddHBand="0" w:evenHBand="0" w:firstRowFirstColumn="0" w:firstRowLastColumn="0" w:lastRowFirstColumn="0" w:lastRowLastColumn="0"/>
+        </w:trPr>
+        <w:tc>
+          <w:tcPr>
+            <w:cnfStyle w:val="001000000000" w:firstRow="0" w:lastRow="0" w:firstColumn="1" w:lastColumn="0" w:oddVBand="0" w:evenVBand="0" w:oddHBand="0" w:evenHBand="0" w:firstRowFirstColumn="0" w:firstRowLastColumn="0" w:lastRowFirstColumn="0" w:lastRowLastColumn="0"/>
+            <w:tcW w:w="2155" w:type="dxa"/>
+          </w:tcPr>
+          <w:p>
+            <w:pPr>
+              <w:rPr>
+                <w:lang w:val="en-ZA"/>
+              </w:rPr>
+            </w:pPr>
+          </w:p>
+        </w:tc>
+        <w:tc>
+          <w:tcPr>
+            <w:tcW w:w="2160" w:type="dxa"/>
+          </w:tcPr>
+          <w:p>
+            <w:pPr>
+              <w:cnfStyle w:val="100000000000" w:firstRow="1" w:lastRow="0" w:firstColumn="0" w:lastColumn="0" w:oddVBand="0" w:evenVBand="0" w:oddHBand="0" w:evenHBand="0" w:firstRowFirstColumn="0" w:firstRowLastColumn="0" w:lastRowFirstColumn="0" w:lastRowLastColumn="0"/>
+              <w:rPr>
+                <w:i/>
+                <w:lang w:val="en-ZA"/>
+              </w:rPr>
+            </w:pPr>
+            <w:r>
+              <w:rPr>
+                <w:i/>
+                <w:lang w:val="en-ZA"/>
+              </w:rPr>
+              <w:t>Participant role</w:t>
+            </w:r>
+          </w:p>
+        </w:tc>
+        <w:tc>
+          <w:tcPr>
+            <w:tcW w:w="4701" w:type="dxa"/>
+          </w:tcPr>
+          <w:p>
+            <w:pPr>
+              <w:cnfStyle w:val="100000000000" w:firstRow="1" w:lastRow="0" w:firstColumn="0" w:lastColumn="0" w:oddVBand="0" w:evenVBand="0" w:oddHBand="0" w:evenHBand="0" w:firstRowFirstColumn="0" w:firstRowLastColumn="0" w:lastRowFirstColumn="0" w:lastRowLastColumn="0"/>
+              <w:rPr>
+                <w:i/>
+                <w:lang w:val="en-ZA"/>
+              </w:rPr>
+            </w:pPr>
+            <w:r>
+              <w:rPr>
+                <w:i/>
+                <w:lang w:val="en-ZA"/>
+              </w:rPr>
+              <w:t>Purpose</w:t>
+            </w:r>
+          </w:p>
+        </w:tc>
+      </w:tr>
+      <w:tr>
+        <w:trPr>
+          <w:cnfStyle w:val="000000100000" w:firstRow="0" w:lastRow="0" w:firstColumn="0" w:lastColumn="0" w:oddVBand="0" w:evenVBand="0" w:oddHBand="1" w:evenHBand="0" w:firstRowFirstColumn="0" w:firstRowLastColumn="0" w:lastRowFirstColumn="0" w:lastRowLastColumn="0"/>
+        </w:trPr>
+        <w:tc>
+          <w:tcPr>
+            <w:cnfStyle w:val="001000000000" w:firstRow="0" w:lastRow="0" w:firstColumn="1" w:lastColumn="0" w:oddVBand="0" w:evenVBand="0" w:oddHBand="0" w:evenHBand="0" w:firstRowFirstColumn="0" w:firstRowLastColumn="0" w:lastRowFirstColumn="0" w:lastRowLastColumn="0"/>
+            <w:tcW w:w="2155" w:type="dxa"/>
+          </w:tcPr>
+          <w:p>
+            <w:pPr>
+              <w:rPr>
+                <w:lang w:val="en-ZA"/>
+              </w:rPr>
+            </w:pPr>
+            <w:r>
+              <w:rPr>
+                <w:lang w:val="en-ZA"/>
+              </w:rPr>
+              <w:t>Connector</w:t>
+            </w:r>
+          </w:p>
+        </w:tc>
+        <w:tc>
+          <w:tcPr>
+            <w:tcW w:w="2160" w:type="dxa"/>
+          </w:tcPr>
+          <w:p>
+            <w:pPr>
+              <w:cnfStyle w:val="000000100000" w:firstRow="0" w:lastRow="0" w:firstColumn="0" w:lastColumn="0" w:oddVBand="0" w:evenVBand="0" w:oddHBand="1" w:evenHBand="0" w:firstRowFirstColumn="0" w:firstRowLastColumn="0" w:lastRowFirstColumn="0" w:lastRowLastColumn="0"/>
+              <w:rPr>
+                <w:lang w:val="en-ZA"/>
+              </w:rPr>
+            </w:pPr>
+            <w:r>
+              <w:rPr>
+                <w:lang w:val="en-ZA"/>
+              </w:rPr>
+              <w:t>Product</w:t>
+            </w:r>
+          </w:p>
+        </w:tc>
+        <w:tc>
+          <w:tcPr>
+            <w:tcW w:w="4701" w:type="dxa"/>
+          </w:tcPr>
+          <w:p>
+            <w:pPr>
+              <w:cnfStyle w:val="000000100000" w:firstRow="0" w:lastRow="0" w:firstColumn="0" w:lastColumn="0" w:oddVBand="0" w:evenVBand="0" w:oddHBand="1" w:evenHBand="0" w:firstRowFirstColumn="0" w:firstRowLastColumn="0" w:lastRowFirstColumn="0" w:lastRowLastColumn="0"/>
+              <w:rPr>
+                <w:lang w:val="en-ZA"/>
+              </w:rPr>
+            </w:pPr>
+            <w:r>
+              <w:rPr>
+                <w:lang w:val="en-ZA"/>
+              </w:rPr>
+              <w:t>Defines the interface the factory method returns</w:t>
+            </w:r>
+          </w:p>
+        </w:tc>
+      </w:tr>
+      <w:tr>
+        <w:tc>
+          <w:tcPr>
+            <w:cnfStyle w:val="001000000000" w:firstRow="0" w:lastRow="0" w:firstColumn="1" w:lastColumn="0" w:oddVBand="0" w:evenVBand="0" w:oddHBand="0" w:evenHBand="0" w:firstRowFirstColumn="0" w:firstRowLastColumn="0" w:lastRowFirstColumn="0" w:lastRowLastColumn="0"/>
+            <w:tcW w:w="2155" w:type="dxa"/>
+          </w:tcPr>
+          <w:p>
+            <w:pPr>
+              <w:rPr>
+                <w:lang w:val="en-ZA"/>
+              </w:rPr>
+            </w:pPr>
+            <w:proofErr w:type="spellStart"/>
+            <w:r>
+              <w:rPr>
+                <w:lang w:val="en-ZA"/>
+              </w:rPr>
+              <w:t>CsvConnector</w:t>
+            </w:r>
+            <w:proofErr w:type="spellEnd"/>
+          </w:p>
+        </w:tc>
+        <w:tc>
+          <w:tcPr>
+            <w:tcW w:w="2160" w:type="dxa"/>
+          </w:tcPr>
+          <w:p>
+            <w:pPr>
+              <w:cnfStyle w:val="000000000000" w:firstRow="0" w:lastRow="0" w:firstColumn="0" w:lastColumn="0" w:oddVBand="0" w:evenVBand="0" w:oddHBand="0" w:evenHBand="0" w:firstRowFirstColumn="0" w:firstRowLastColumn="0" w:lastRowFirstColumn="0" w:lastRowLastColumn="0"/>
+              <w:rPr>
+                <w:lang w:val="en-ZA"/>
+              </w:rPr>
+            </w:pPr>
+            <w:proofErr w:type="spellStart"/>
+            <w:r>
+              <w:rPr>
+                <w:lang w:val="en-ZA"/>
+              </w:rPr>
+              <w:t>ConcreteP</w:t>
+            </w:r>
+            <w:r>
+              <w:rPr>
+                <w:lang w:val="en-ZA"/>
+              </w:rPr>
+              <w:t>roduct</w:t>
+            </w:r>
+            <w:proofErr w:type="spellEnd"/>
+          </w:p>
+        </w:tc>
+        <w:tc>
+          <w:tcPr>
+            <w:tcW w:w="4701" w:type="dxa"/>
+          </w:tcPr>
+          <w:p>
+            <w:pPr>
+              <w:cnfStyle w:val="000000000000" w:firstRow="0" w:lastRow="0" w:firstColumn="0" w:lastColumn="0" w:oddVBand="0" w:evenVBand="0" w:oddHBand="0" w:evenHBand="0" w:firstRowFirstColumn="0" w:firstRowLastColumn="0" w:lastRowFirstColumn="0" w:lastRowLastColumn="0"/>
+              <w:rPr>
+                <w:lang w:val="en-ZA"/>
+              </w:rPr>
+            </w:pPr>
+            <w:r>
+              <w:rPr>
+                <w:lang w:val="en-ZA"/>
+              </w:rPr>
+              <w:t>Implements that interface with concrete behaviour</w:t>
+            </w:r>
+          </w:p>
+        </w:tc>
+      </w:tr>
+      <w:tr>
+        <w:trPr>
+          <w:cnfStyle w:val="000000100000" w:firstRow="0" w:lastRow="0" w:firstColumn="0" w:lastColumn="0" w:oddVBand="0" w:evenVBand="0" w:oddHBand="1" w:evenHBand="0" w:firstRowFirstColumn="0" w:firstRowLastColumn="0" w:lastRowFirstColumn="0" w:lastRowLastColumn="0"/>
+        </w:trPr>
+        <w:tc>
+          <w:tcPr>
+            <w:cnfStyle w:val="001000000000" w:firstRow="0" w:lastRow="0" w:firstColumn="1" w:lastColumn="0" w:oddVBand="0" w:evenVBand="0" w:oddHBand="0" w:evenHBand="0" w:firstRowFirstColumn="0" w:firstRowLastColumn="0" w:lastRowFirstColumn="0" w:lastRowLastColumn="0"/>
+            <w:tcW w:w="2155" w:type="dxa"/>
+          </w:tcPr>
+          <w:p>
+            <w:pPr>
+              <w:rPr>
+                <w:lang w:val="en-ZA"/>
+              </w:rPr>
+            </w:pPr>
+            <w:proofErr w:type="spellStart"/>
+            <w:r>
+              <w:rPr>
+                <w:lang w:val="en-ZA"/>
+              </w:rPr>
+              <w:t>ConnectorFactory</w:t>
+            </w:r>
+            <w:proofErr w:type="spellEnd"/>
+          </w:p>
+        </w:tc>
+        <w:tc>
+          <w:tcPr>
+            <w:tcW w:w="2160" w:type="dxa"/>
+          </w:tcPr>
+          <w:p>
+            <w:pPr>
+              <w:cnfStyle w:val="000000100000" w:firstRow="0" w:lastRow="0" w:firstColumn="0" w:lastColumn="0" w:oddVBand="0" w:evenVBand="0" w:oddHBand="1" w:evenHBand="0" w:firstRowFirstColumn="0" w:firstRowLastColumn="0" w:lastRowFirstColumn="0" w:lastRowLastColumn="0"/>
+              <w:rPr>
+                <w:lang w:val="en-ZA"/>
+              </w:rPr>
+            </w:pPr>
+            <w:r>
+              <w:rPr>
+                <w:lang w:val="en-ZA"/>
+              </w:rPr>
+              <w:t>Creator</w:t>
+            </w:r>
+          </w:p>
+        </w:tc>
+        <w:tc>
+          <w:tcPr>
+            <w:tcW w:w="4701" w:type="dxa"/>
+          </w:tcPr>
+          <w:p>
+            <w:pPr>
+              <w:cnfStyle w:val="000000100000" w:firstRow="0" w:lastRow="0" w:firstColumn="0" w:lastColumn="0" w:oddVBand="0" w:evenVBand="0" w:oddHBand="1" w:evenHBand="0" w:firstRowFirstColumn="0" w:firstRowLastColumn="0" w:lastRowFirstColumn="0" w:lastRowLastColumn="0"/>
+              <w:rPr>
+                <w:lang w:val="en-ZA"/>
+              </w:rPr>
+            </w:pPr>
+            <w:r>
+              <w:rPr>
+                <w:lang w:val="en-ZA"/>
+              </w:rPr>
+              <w:t>Declares the factory method without committing to a concrete return type.</w:t>
+            </w:r>
+          </w:p>
+        </w:tc>
+      </w:tr>
+      <w:tr>
+        <w:tc>
+          <w:tcPr>
+            <w:cnfStyle w:val="001000000000" w:firstRow="0" w:lastRow="0" w:firstColumn="1" w:lastColumn="0" w:oddVBand="0" w:evenVBand="0" w:oddHBand="0" w:evenHBand="0" w:firstRowFirstColumn="0" w:firstRowLastColumn="0" w:lastRowFirstColumn="0" w:lastRowLastColumn="0"/>
+            <w:tcW w:w="2155" w:type="dxa"/>
+          </w:tcPr>
+          <w:p>
+            <w:pPr>
+              <w:rPr>
+                <w:lang w:val="en-ZA"/>
+              </w:rPr>
+            </w:pPr>
+            <w:proofErr w:type="spellStart"/>
+            <w:r>
+              <w:rPr>
+                <w:lang w:val="en-ZA"/>
+              </w:rPr>
+              <w:t>CsvFactory</w:t>
+            </w:r>
+            <w:proofErr w:type="spellEnd"/>
+          </w:p>
+        </w:tc>
+        <w:tc>
+          <w:tcPr>
+            <w:tcW w:w="2160" w:type="dxa"/>
+          </w:tcPr>
+          <w:p>
+            <w:pPr>
+              <w:cnfStyle w:val="000000000000" w:firstRow="0" w:lastRow="0" w:firstColumn="0" w:lastColumn="0" w:oddVBand="0" w:evenVBand="0" w:oddHBand="0" w:evenHBand="0" w:firstRowFirstColumn="0" w:firstRowLastColumn="0" w:lastRowFirstColumn="0" w:lastRowLastColumn="0"/>
+              <w:rPr>
+                <w:lang w:val="en-ZA"/>
+              </w:rPr>
+            </w:pPr>
+            <w:proofErr w:type="spellStart"/>
+            <w:r>
+              <w:rPr>
+                <w:lang w:val="en-ZA"/>
+              </w:rPr>
+              <w:t>ConcreteCreator</w:t>
+            </w:r>
+            <w:proofErr w:type="spellEnd"/>
+          </w:p>
+        </w:tc>
+        <w:tc>
+          <w:tcPr>
+            <w:tcW w:w="4701" w:type="dxa"/>
+          </w:tcPr>
+          <w:p>
+            <w:pPr>
+              <w:cnfStyle w:val="000000000000" w:firstRow="0" w:lastRow="0" w:firstColumn="0" w:lastColumn="0" w:oddVBand="0" w:evenVBand="0" w:oddHBand="0" w:evenHBand="0" w:firstRowFirstColumn="0" w:firstRowLastColumn="0" w:lastRowFirstColumn="0" w:lastRowLastColumn="0"/>
+              <w:rPr>
+                <w:lang w:val="en-ZA"/>
+              </w:rPr>
+            </w:pPr>
+            <w:r>
+              <w:rPr>
+                <w:lang w:val="en-ZA"/>
+              </w:rPr>
+              <w:t xml:space="preserve">Overrides the factory method to return a specific </w:t>
+            </w:r>
+            <w:proofErr w:type="spellStart"/>
+            <w:r>
+              <w:rPr>
+                <w:lang w:val="en-ZA"/>
+              </w:rPr>
+              <w:t>ConcreteProduct</w:t>
+            </w:r>
+            <w:proofErr w:type="spellEnd"/>
+            <w:r>
+              <w:rPr>
+                <w:lang w:val="en-ZA"/>
+              </w:rPr>
+              <w:t>.</w:t>
+            </w:r>
+          </w:p>
+        </w:tc>
+      </w:tr>
+    </w:tbl>
+    <w:p>
+      <w:pPr>
+        <w:rPr>
+          <w:lang w:val="en-ZA"/>
+        </w:rPr>
+      </w:pPr>
+    </w:p>
+    <w:p>
+      <w:pPr>
+        <w:rPr>
+          <w:lang w:val="en-ZA"/>
+        </w:rPr>
+      </w:pPr>
+    </w:p>
     <w:p>
       <w:pPr>
         <w:rPr>
@@ -90,21 +713,130 @@
         <w:rPr>
           <w:lang w:val="en-ZA"/>
         </w:rPr>
-        <w:t xml:space="preserve">) function must produce a deep </w:t>
+        <w:t>) function must produce a deep copy  of the prototype so that all the clones are independent and modifications on one of the clones does not impact the other clones</w:t>
+      </w:r>
+      <w:r>
+        <w:rPr>
+          <w:lang w:val="en-ZA"/>
+        </w:rPr>
+        <w:t>.</w:t>
+      </w:r>
+    </w:p>
+    <w:p>
+      <w:pPr>
+        <w:rPr>
+          <w:lang w:val="en-ZA"/>
+        </w:rPr>
+      </w:pPr>
+      <w:r>
+        <w:rPr>
+          <w:lang w:val="en-ZA"/>
+        </w:rPr>
+        <w:t xml:space="preserve">2.6 </w:t>
+      </w:r>
+    </w:p>
+    <w:p>
+      <w:pPr>
+        <w:rPr>
+          <w:lang w:val="en-ZA"/>
+        </w:rPr>
+      </w:pPr>
+      <w:r>
+        <w:rPr>
+          <w:lang w:val="en-ZA"/>
+        </w:rPr>
+        <w:t xml:space="preserve">The registry returns </w:t>
       </w:r>
       <w:proofErr w:type="gramStart"/>
       <w:r>
         <w:rPr>
           <w:lang w:val="en-ZA"/>
         </w:rPr>
-        <w:t>copy  of</w:t>
+        <w:t>clone(</w:t>
       </w:r>
       <w:proofErr w:type="gramEnd"/>
       <w:r>
         <w:rPr>
           <w:lang w:val="en-ZA"/>
         </w:rPr>
-        <w:t xml:space="preserve"> the prototype so that all the clones are independent and modifications on one of the clones does not impact the other clones</w:t>
+        <w:t xml:space="preserve">)s rather than the stored pointer because if they shared the same prototype object, if one pipeline modified the transformation’s state, the </w:t>
+      </w:r>
+      <w:r>
+        <w:rPr>
+          <w:lang w:val="en-ZA"/>
+        </w:rPr>
+        <w:lastRenderedPageBreak/>
+        <w:t>other pipeline would be affected. This could lead to issues such as dangling pointers and double deletion. Returning clones gives both pipelines their own separate copy to avoid these issues.</w:t>
+      </w:r>
+    </w:p>
+    <w:p>
+      <w:pPr>
+        <w:rPr>
+          <w:lang w:val="en-ZA"/>
+        </w:rPr>
+      </w:pPr>
+      <w:r>
+        <w:rPr>
+          <w:lang w:val="en-ZA"/>
+        </w:rPr>
+        <w:t xml:space="preserve">Task 3 </w:t>
+      </w:r>
+    </w:p>
+    <w:p>
+      <w:pPr>
+        <w:rPr>
+          <w:lang w:val="en-ZA"/>
+        </w:rPr>
+      </w:pPr>
+      <w:r>
+        <w:rPr>
+          <w:lang w:val="en-ZA"/>
+        </w:rPr>
+        <w:t>3.5</w:t>
+      </w:r>
+    </w:p>
+    <w:p>
+      <w:pPr>
+        <w:rPr>
+          <w:lang w:val="en-ZA"/>
+        </w:rPr>
+      </w:pPr>
+      <w:proofErr w:type="gramStart"/>
+      <w:r>
+        <w:rPr>
+          <w:lang w:val="en-ZA"/>
+        </w:rPr>
+        <w:t>run(</w:t>
+      </w:r>
+      <w:proofErr w:type="gramEnd"/>
+      <w:r>
+        <w:rPr>
+          <w:lang w:val="en-ZA"/>
+        </w:rPr>
+        <w:t>) is deliberately not virtual because it specifies the specific order in which connect(),extract(), transform() and load() should be executed in each subclass. If the subclasses could override it, this could lead to some of the functions not be executed at all or in the wrong order.</w:t>
+      </w:r>
+      <w:r>
+        <w:t xml:space="preserve"> </w:t>
+      </w:r>
+      <w:r>
+        <w:rPr>
+          <w:lang w:val="en-ZA"/>
+        </w:rPr>
+        <w:t xml:space="preserve">Making </w:t>
+      </w:r>
+      <w:proofErr w:type="gramStart"/>
+      <w:r>
+        <w:rPr>
+          <w:lang w:val="en-ZA"/>
+        </w:rPr>
+        <w:t>run(</w:t>
+      </w:r>
+      <w:proofErr w:type="gramEnd"/>
+      <w:r>
+        <w:rPr>
+          <w:lang w:val="en-ZA"/>
+        </w:rPr>
+        <w:t>) non-virtual guarantees that every pipeline follows the same processing sequence</w:t>
       </w:r>
       <w:r>
         <w:rPr>
@@ -119,57 +851,18 @@
           <w:lang w:val="en-ZA"/>
         </w:rPr>
       </w:pPr>
-      <w:r>
-        <w:rPr>
-          <w:lang w:val="en-ZA"/>
-        </w:rPr>
-        <w:t xml:space="preserve">2.6 </w:t>
-      </w:r>
-    </w:p>
-    <w:p>
-      <w:pPr>
-        <w:rPr>
-          <w:lang w:val="en-ZA"/>
-        </w:rPr>
-      </w:pPr>
-    </w:p>
-    <w:p>
-      <w:pPr>
-        <w:rPr>
-          <w:lang w:val="en-ZA"/>
-        </w:rPr>
-      </w:pPr>
-      <w:r>
-        <w:rPr>
-          <w:lang w:val="en-ZA"/>
-        </w:rPr>
-        <w:t>The registry returns clone()s rather than the stored pointer because if they shared the same prototype object, if one pipeline modified the transformation’s state, the other pipeline would be affected. This could lead to issues such as dangling pointers and double deletion. Returning clones gives both pipelines their own separate copy to avoid these issues.</w:t>
-      </w:r>
-    </w:p>
-    <w:p>
-      <w:pPr>
-        <w:rPr>
-          <w:lang w:val="en-ZA"/>
-        </w:rPr>
-      </w:pPr>
-      <w:r>
-        <w:rPr>
-          <w:lang w:val="en-ZA"/>
-        </w:rPr>
-        <w:t xml:space="preserve">Task 3 </w:t>
-      </w:r>
-    </w:p>
-    <w:p>
-      <w:pPr>
-        <w:rPr>
-          <w:lang w:val="en-ZA"/>
-        </w:rPr>
-      </w:pPr>
-      <w:r>
-        <w:rPr>
-          <w:lang w:val="en-ZA"/>
-        </w:rPr>
-        <w:t>3.5</w:t>
+    </w:p>
+    <w:p>
+      <w:pPr>
+        <w:rPr>
+          <w:lang w:val="en-ZA"/>
+        </w:rPr>
+      </w:pPr>
+      <w:r>
+        <w:rPr>
+          <w:lang w:val="en-ZA"/>
+        </w:rPr>
+        <w:t>3.6</w:t>
       </w:r>
     </w:p>
     <w:p>
@@ -190,27 +883,62 @@
         <w:rPr>
           <w:lang w:val="en-ZA"/>
         </w:rPr>
-        <w:t>) is deliberately not virtual because it specifies the specific order in which connect(</w:t>
-      </w:r>
+        <w:t>)- template method,</w:t>
+      </w:r>
+    </w:p>
+    <w:p>
+      <w:pPr>
+        <w:rPr>
+          <w:lang w:val="en-ZA"/>
+        </w:rPr>
+      </w:pPr>
       <w:proofErr w:type="gramStart"/>
       <w:r>
         <w:rPr>
           <w:lang w:val="en-ZA"/>
         </w:rPr>
-        <w:t>),extract</w:t>
+        <w:t>connect(</w:t>
       </w:r>
       <w:proofErr w:type="gramEnd"/>
       <w:r>
         <w:rPr>
           <w:lang w:val="en-ZA"/>
         </w:rPr>
-        <w:t xml:space="preserve">(), </w:t>
-      </w:r>
+        <w:t>)- concrete step</w:t>
+      </w:r>
+    </w:p>
+    <w:p>
+      <w:pPr>
+        <w:rPr>
+          <w:lang w:val="en-ZA"/>
+        </w:rPr>
+      </w:pPr>
       <w:proofErr w:type="gramStart"/>
       <w:r>
         <w:rPr>
           <w:lang w:val="en-ZA"/>
         </w:rPr>
+        <w:t>extract(</w:t>
+      </w:r>
+      <w:proofErr w:type="gramEnd"/>
+      <w:r>
+        <w:rPr>
+          <w:lang w:val="en-ZA"/>
+        </w:rPr>
+        <w:t>) – primitive operation</w:t>
+      </w:r>
+    </w:p>
+    <w:p>
+      <w:pPr>
+        <w:rPr>
+          <w:lang w:val="en-ZA"/>
+        </w:rPr>
+      </w:pPr>
+      <w:proofErr w:type="gramStart"/>
+      <w:r>
+        <w:rPr>
+          <w:lang w:val="en-ZA"/>
+        </w:rPr>
         <w:t>transform(</w:t>
       </w:r>
       <w:proofErr w:type="gramEnd"/>
@@ -218,8 +946,15 @@
         <w:rPr>
           <w:lang w:val="en-ZA"/>
         </w:rPr>
-        <w:t xml:space="preserve">) and </w:t>
-      </w:r>
+        <w:t>) – concrete step</w:t>
+      </w:r>
+    </w:p>
+    <w:p>
+      <w:pPr>
+        <w:rPr>
+          <w:lang w:val="en-ZA"/>
+        </w:rPr>
+      </w:pPr>
       <w:proofErr w:type="gramStart"/>
       <w:r>
         <w:rPr>
@@ -232,45 +967,340 @@
         <w:rPr>
           <w:lang w:val="en-ZA"/>
         </w:rPr>
-        <w:t xml:space="preserve">) should be executed in each subclass. If the subclasses could override it, this could lead to some of the functions </w:t>
-      </w:r>
+        <w:t>) – primitive operation</w:t>
+      </w:r>
+    </w:p>
+    <w:p>
+      <w:pPr>
+        <w:rPr>
+          <w:lang w:val="en-ZA"/>
+        </w:rPr>
+      </w:pPr>
+      <w:r>
+        <w:rPr>
+          <w:lang w:val="en-ZA"/>
+        </w:rPr>
+        <w:t xml:space="preserve">The Factory method created the connector object without the pipeline needing to know which concrete connector class is being used. The template method makes sure that all the pipeline objects follow the same logical sequence/algorithm. They do not overlap because they do not perform the same function. The template method manages the algorithm while the factory class manages object creation. </w:t>
+      </w:r>
+    </w:p>
+    <w:p>
+      <w:pPr>
+        <w:rPr>
+          <w:lang w:val="en-ZA"/>
+        </w:rPr>
+      </w:pPr>
+    </w:p>
+    <w:p>
+      <w:pPr>
+        <w:rPr>
+          <w:lang w:val="en-ZA"/>
+        </w:rPr>
+      </w:pPr>
+      <w:r>
+        <w:rPr>
+          <w:lang w:val="en-ZA"/>
+        </w:rPr>
+        <w:t>Task 4</w:t>
+      </w:r>
+    </w:p>
+    <w:p>
+      <w:pPr>
+        <w:rPr>
+          <w:lang w:val="en-ZA"/>
+        </w:rPr>
+      </w:pPr>
+      <w:r>
+        <w:rPr>
+          <w:lang w:val="en-ZA"/>
+        </w:rPr>
+        <w:t>4.4</w:t>
+      </w:r>
+      <w:r>
+        <w:rPr>
+          <w:lang w:val="en-ZA"/>
+        </w:rPr>
+        <w:t>*********** INCOMPLETE*************</w:t>
+      </w:r>
+    </w:p>
+    <w:p>
+      <w:pPr>
+        <w:rPr>
+          <w:b/>
+          <w:lang w:val="en-ZA"/>
+        </w:rPr>
+      </w:pPr>
+      <w:r>
+        <w:rPr>
+          <w:b/>
+          <w:lang w:val="en-ZA"/>
+        </w:rPr>
+        <w:t>Wide Interface</w:t>
+      </w:r>
+    </w:p>
+    <w:p>
+      <w:pPr>
+        <w:rPr>
+          <w:lang w:val="en-ZA"/>
+        </w:rPr>
+      </w:pPr>
+      <w:r>
+        <w:rPr>
+          <w:lang w:val="en-ZA"/>
+        </w:rPr>
+        <w:t>The wide interface exposes the full captured state and i</w:t>
+      </w:r>
+      <w:r>
+        <w:rPr>
+          <w:lang w:val="en-ZA"/>
+        </w:rPr>
+        <w:t xml:space="preserve">s meant for the </w:t>
+      </w:r>
+      <w:r>
+        <w:rPr>
+          <w:b/>
+          <w:lang w:val="en-ZA"/>
+        </w:rPr>
+        <w:t xml:space="preserve">Originator </w:t>
+      </w:r>
+      <w:r>
+        <w:rPr>
+          <w:lang w:val="en-ZA"/>
+        </w:rPr>
+        <w:t>only.</w:t>
+      </w:r>
+      <w:r>
+        <w:rPr>
+          <w:lang w:val="en-ZA"/>
+        </w:rPr>
+        <w:t xml:space="preserve"> Pipeline is the only class that calls </w:t>
+      </w:r>
+      <w:proofErr w:type="spellStart"/>
       <w:proofErr w:type="gramStart"/>
       <w:r>
         <w:rPr>
-          <w:lang w:val="en-ZA"/>
-        </w:rPr>
-        <w:t>not be</w:t>
+          <w:i/>
+          <w:lang w:val="en-ZA"/>
+        </w:rPr>
+        <w:t>getStage</w:t>
+      </w:r>
+      <w:proofErr w:type="spellEnd"/>
+      <w:r>
+        <w:rPr>
+          <w:i/>
+          <w:lang w:val="en-ZA"/>
+        </w:rPr>
+        <w:t>(</w:t>
       </w:r>
       <w:proofErr w:type="gramEnd"/>
       <w:r>
         <w:rPr>
-          <w:lang w:val="en-ZA"/>
-        </w:rPr>
-        <w:t xml:space="preserve"> executed at all or in the wrong order.</w:t>
-      </w:r>
-      <w:r>
-        <w:t xml:space="preserve"> </w:t>
-      </w:r>
-      <w:r>
-        <w:rPr>
-          <w:lang w:val="en-ZA"/>
-        </w:rPr>
-        <w:t xml:space="preserve">Making </w:t>
+          <w:i/>
+          <w:lang w:val="en-ZA"/>
+        </w:rPr>
+        <w:t>)</w:t>
+      </w:r>
+      <w:r>
+        <w:rPr>
+          <w:lang w:val="en-ZA"/>
+        </w:rPr>
+        <w:t xml:space="preserve"> and </w:t>
+      </w:r>
+      <w:proofErr w:type="spellStart"/>
+      <w:r>
+        <w:rPr>
+          <w:i/>
+          <w:lang w:val="en-ZA"/>
+        </w:rPr>
+        <w:t>getRecords</w:t>
+      </w:r>
+      <w:proofErr w:type="spellEnd"/>
+      <w:r>
+        <w:rPr>
+          <w:i/>
+          <w:lang w:val="en-ZA"/>
+        </w:rPr>
+        <w:t>()</w:t>
+      </w:r>
+      <w:r>
+        <w:rPr>
+          <w:lang w:val="en-ZA"/>
+        </w:rPr>
+        <w:t xml:space="preserve"> since it is the only one that knows what that state means and how to use it, via </w:t>
+      </w:r>
+      <w:proofErr w:type="spellStart"/>
+      <w:r>
+        <w:rPr>
+          <w:i/>
+          <w:lang w:val="en-ZA"/>
+        </w:rPr>
+        <w:t>creatCheckpoint</w:t>
+      </w:r>
+      <w:proofErr w:type="spellEnd"/>
+      <w:r>
+        <w:rPr>
+          <w:i/>
+          <w:lang w:val="en-ZA"/>
+        </w:rPr>
+        <w:t>()</w:t>
+      </w:r>
+      <w:r>
+        <w:rPr>
+          <w:lang w:val="en-ZA"/>
+        </w:rPr>
+        <w:t xml:space="preserve"> and </w:t>
+      </w:r>
+      <w:r>
+        <w:rPr>
+          <w:i/>
+          <w:lang w:val="en-ZA"/>
+        </w:rPr>
+        <w:t>restore()</w:t>
+      </w:r>
+      <w:r>
+        <w:rPr>
+          <w:lang w:val="en-ZA"/>
+        </w:rPr>
+        <w:t xml:space="preserve">. </w:t>
+      </w:r>
+    </w:p>
+    <w:p>
+      <w:pPr>
+        <w:rPr>
+          <w:b/>
+          <w:lang w:val="en-ZA"/>
+        </w:rPr>
+      </w:pPr>
+      <w:r>
+        <w:rPr>
+          <w:b/>
+          <w:lang w:val="en-ZA"/>
+        </w:rPr>
+        <w:t>Narrow Interface</w:t>
+      </w:r>
+    </w:p>
+    <w:p>
+      <w:pPr>
+        <w:rPr>
+          <w:lang w:val="en-ZA"/>
+        </w:rPr>
+      </w:pPr>
+      <w:r>
+        <w:rPr>
+          <w:lang w:val="en-ZA"/>
+        </w:rPr>
+        <w:t>The narrow interface is what everyone (</w:t>
+      </w:r>
+      <w:r>
+        <w:rPr>
+          <w:b/>
+          <w:lang w:val="en-ZA"/>
+        </w:rPr>
+        <w:t>the C</w:t>
+      </w:r>
+      <w:r>
+        <w:rPr>
+          <w:b/>
+          <w:lang w:val="en-ZA"/>
+        </w:rPr>
+        <w:t>aretaker</w:t>
+      </w:r>
+      <w:r>
+        <w:rPr>
+          <w:lang w:val="en-ZA"/>
+        </w:rPr>
+        <w:t>) is meant to see.</w:t>
+      </w:r>
+    </w:p>
+    <w:p>
+      <w:pPr>
+        <w:rPr>
+          <w:lang w:val="en-ZA"/>
+        </w:rPr>
+      </w:pPr>
+    </w:p>
+    <w:p>
+      <w:pPr>
+        <w:rPr>
+          <w:lang w:val="en-ZA"/>
+        </w:rPr>
+      </w:pPr>
+      <w:r>
+        <w:rPr>
+          <w:lang w:val="en-ZA"/>
+        </w:rPr>
+        <w:lastRenderedPageBreak/>
+        <w:t>4.5</w:t>
+      </w:r>
+    </w:p>
+    <w:p>
+      <w:pPr>
+        <w:pStyle w:val="ListParagraph"/>
+        <w:numPr>
+          <w:ilvl w:val="0"/>
+          <w:numId w:val="1"/>
+        </w:numPr>
+        <w:rPr>
+          <w:lang w:val="en-ZA"/>
+        </w:rPr>
+      </w:pPr>
+      <w:r>
+        <w:rPr>
+          <w:lang w:val="en-ZA"/>
+        </w:rPr>
+        <w:t xml:space="preserve">During a normal run, after </w:t>
       </w:r>
       <w:proofErr w:type="gramStart"/>
       <w:r>
         <w:rPr>
-          <w:lang w:val="en-ZA"/>
-        </w:rPr>
-        <w:t>run(</w:t>
+          <w:i/>
+          <w:lang w:val="en-ZA"/>
+        </w:rPr>
+        <w:t>transform(</w:t>
       </w:r>
       <w:proofErr w:type="gramEnd"/>
       <w:r>
         <w:rPr>
-          <w:lang w:val="en-ZA"/>
-        </w:rPr>
-        <w:t>) non-virtual guarantees that every pipeline follows the same processing sequence</w:t>
-      </w:r>
+          <w:i/>
+          <w:lang w:val="en-ZA"/>
+        </w:rPr>
+        <w:t xml:space="preserve">) </w:t>
+      </w:r>
+      <w:r>
+        <w:rPr>
+          <w:lang w:val="en-ZA"/>
+        </w:rPr>
+        <w:t xml:space="preserve">finishes the pipeline will call </w:t>
+      </w:r>
+      <w:proofErr w:type="spellStart"/>
+      <w:r>
+        <w:rPr>
+          <w:i/>
+          <w:lang w:val="en-ZA"/>
+        </w:rPr>
+        <w:t>createCheckpoint</w:t>
+      </w:r>
+      <w:proofErr w:type="spellEnd"/>
+      <w:r>
+        <w:rPr>
+          <w:i/>
+          <w:lang w:val="en-ZA"/>
+        </w:rPr>
+        <w:t>(),</w:t>
+      </w:r>
+      <w:r>
+        <w:rPr>
+          <w:lang w:val="en-ZA"/>
+        </w:rPr>
+        <w:t xml:space="preserve"> which packages its current stage and records into a new </w:t>
+      </w:r>
+      <w:proofErr w:type="spellStart"/>
+      <w:r>
+        <w:rPr>
+          <w:lang w:val="en-ZA"/>
+        </w:rPr>
+        <w:t>RunCheckpoint</w:t>
+      </w:r>
+      <w:proofErr w:type="spellEnd"/>
       <w:r>
         <w:rPr>
           <w:lang w:val="en-ZA"/>
@@ -280,47 +1310,51 @@
     </w:p>
     <w:p>
       <w:pPr>
-        <w:rPr>
-          <w:lang w:val="en-ZA"/>
-        </w:rPr>
-      </w:pPr>
-    </w:p>
-    <w:p>
-      <w:pPr>
-        <w:rPr>
-          <w:lang w:val="en-ZA"/>
-        </w:rPr>
-      </w:pPr>
-      <w:r>
-        <w:rPr>
-          <w:lang w:val="en-ZA"/>
-        </w:rPr>
-        <w:t>3.6</w:t>
-      </w:r>
-    </w:p>
-    <w:p>
-      <w:pPr>
-        <w:rPr>
-          <w:lang w:val="en-ZA"/>
-        </w:rPr>
-      </w:pPr>
+        <w:pStyle w:val="ListParagraph"/>
+        <w:numPr>
+          <w:ilvl w:val="0"/>
+          <w:numId w:val="1"/>
+        </w:numPr>
+        <w:rPr>
+          <w:lang w:val="en-ZA"/>
+        </w:rPr>
+      </w:pPr>
+      <w:r>
+        <w:rPr>
+          <w:lang w:val="en-ZA"/>
+        </w:rPr>
+        <w:t xml:space="preserve">That checkpoint it then passed to </w:t>
+      </w:r>
+      <w:proofErr w:type="spellStart"/>
       <w:proofErr w:type="gramStart"/>
       <w:r>
         <w:rPr>
           <w:lang w:val="en-ZA"/>
         </w:rPr>
-        <w:t>run(</w:t>
+        <w:t>CheckpointManager</w:t>
+      </w:r>
+      <w:proofErr w:type="spellEnd"/>
+      <w:r>
+        <w:rPr>
+          <w:lang w:val="en-ZA"/>
+        </w:rPr>
+        <w:t>::</w:t>
       </w:r>
       <w:proofErr w:type="gramEnd"/>
       <w:r>
         <w:rPr>
           <w:lang w:val="en-ZA"/>
         </w:rPr>
-        <w:t>)- template method,</w:t>
-      </w:r>
-    </w:p>
-    <w:p>
-      <w:pPr>
+        <w:t>save(), which appends it to its history.</w:t>
+      </w:r>
+    </w:p>
+    <w:p>
+      <w:pPr>
+        <w:pStyle w:val="ListParagraph"/>
+        <w:numPr>
+          <w:ilvl w:val="0"/>
+          <w:numId w:val="1"/>
+        </w:numPr>
         <w:rPr>
           <w:lang w:val="en-ZA"/>
         </w:rPr>
@@ -328,48 +1362,113 @@
       <w:proofErr w:type="gramStart"/>
       <w:r>
         <w:rPr>
-          <w:lang w:val="en-ZA"/>
-        </w:rPr>
-        <w:t>connect(</w:t>
+          <w:i/>
+          <w:lang w:val="en-ZA"/>
+        </w:rPr>
+        <w:t>load(</w:t>
       </w:r>
       <w:proofErr w:type="gramEnd"/>
       <w:r>
         <w:rPr>
-          <w:lang w:val="en-ZA"/>
-        </w:rPr>
-        <w:t>)- concrete step</w:t>
-      </w:r>
-    </w:p>
-    <w:p>
-      <w:pPr>
-        <w:rPr>
-          <w:lang w:val="en-ZA"/>
-        </w:rPr>
-      </w:pPr>
+          <w:i/>
+          <w:lang w:val="en-ZA"/>
+        </w:rPr>
+        <w:t xml:space="preserve">) </w:t>
+      </w:r>
+      <w:r>
+        <w:rPr>
+          <w:lang w:val="en-ZA"/>
+        </w:rPr>
+        <w:t>runs next and hypothetically the program crashes at 02:00 before it completes.</w:t>
+      </w:r>
+    </w:p>
+    <w:p>
+      <w:pPr>
+        <w:pStyle w:val="ListParagraph"/>
+        <w:numPr>
+          <w:ilvl w:val="0"/>
+          <w:numId w:val="1"/>
+        </w:numPr>
+        <w:rPr>
+          <w:lang w:val="en-ZA"/>
+        </w:rPr>
+      </w:pPr>
+      <w:r>
+        <w:rPr>
+          <w:lang w:val="en-ZA"/>
+        </w:rPr>
+        <w:t>Upon restart a new pipeline object will be constructed with the same type of factory as the failed run.</w:t>
+      </w:r>
+    </w:p>
+    <w:p>
+      <w:pPr>
+        <w:pStyle w:val="ListParagraph"/>
+        <w:numPr>
+          <w:ilvl w:val="0"/>
+          <w:numId w:val="1"/>
+        </w:numPr>
+        <w:rPr>
+          <w:lang w:val="en-ZA"/>
+        </w:rPr>
+      </w:pPr>
+      <w:proofErr w:type="spellStart"/>
       <w:proofErr w:type="gramStart"/>
       <w:r>
         <w:rPr>
           <w:lang w:val="en-ZA"/>
         </w:rPr>
-        <w:t>extract(</w:t>
+        <w:t>CheckpointManager</w:t>
+      </w:r>
+      <w:proofErr w:type="spellEnd"/>
+      <w:r>
+        <w:rPr>
+          <w:lang w:val="en-ZA"/>
+        </w:rPr>
+        <w:t>::</w:t>
       </w:r>
       <w:proofErr w:type="gramEnd"/>
       <w:r>
         <w:rPr>
           <w:lang w:val="en-ZA"/>
         </w:rPr>
-        <w:t>) – primitive operation</w:t>
-      </w:r>
-    </w:p>
-    <w:p>
-      <w:pPr>
-        <w:rPr>
-          <w:lang w:val="en-ZA"/>
-        </w:rPr>
-      </w:pPr>
+        <w:t xml:space="preserve">undo() is called, popping and returning the most recently saved </w:t>
+      </w:r>
+      <w:proofErr w:type="spellStart"/>
+      <w:r>
+        <w:rPr>
+          <w:lang w:val="en-ZA"/>
+        </w:rPr>
+        <w:t>RunCheckpoint</w:t>
+      </w:r>
+      <w:proofErr w:type="spellEnd"/>
+      <w:r>
+        <w:rPr>
+          <w:lang w:val="en-ZA"/>
+        </w:rPr>
+        <w:t>.</w:t>
+      </w:r>
+    </w:p>
+    <w:p>
+      <w:pPr>
+        <w:pStyle w:val="ListParagraph"/>
+        <w:numPr>
+          <w:ilvl w:val="0"/>
+          <w:numId w:val="1"/>
+        </w:numPr>
+        <w:rPr>
+          <w:lang w:val="en-ZA"/>
+        </w:rPr>
+      </w:pPr>
+      <w:r>
+        <w:rPr>
+          <w:lang w:val="en-ZA"/>
+        </w:rPr>
+        <w:t xml:space="preserve">The new pipeline calls restore(checkpoint), which sets its stage and records back to exactly where the previous successful checkpoint left off (after </w:t>
+      </w:r>
       <w:proofErr w:type="gramStart"/>
       <w:r>
         <w:rPr>
+          <w:color w:val="215E99" w:themeColor="text2" w:themeTint="BF"/>
           <w:lang w:val="en-ZA"/>
         </w:rPr>
         <w:t>transform(</w:t>
@@ -377,51 +1476,330 @@
       <w:proofErr w:type="gramEnd"/>
       <w:r>
         <w:rPr>
-          <w:lang w:val="en-ZA"/>
-        </w:rPr>
-        <w:t>) – concrete step</w:t>
-      </w:r>
-    </w:p>
-    <w:p>
-      <w:pPr>
-        <w:rPr>
-          <w:lang w:val="en-ZA"/>
-        </w:rPr>
-      </w:pPr>
+          <w:color w:val="215E99" w:themeColor="text2" w:themeTint="BF"/>
+          <w:lang w:val="en-ZA"/>
+        </w:rPr>
+        <w:t>)</w:t>
+      </w:r>
+      <w:r>
+        <w:rPr>
+          <w:lang w:val="en-ZA"/>
+        </w:rPr>
+        <w:t xml:space="preserve"> and before </w:t>
+      </w:r>
+      <w:r>
+        <w:rPr>
+          <w:color w:val="215E99" w:themeColor="text2" w:themeTint="BF"/>
+          <w:lang w:val="en-ZA"/>
+        </w:rPr>
+        <w:t>load()</w:t>
+      </w:r>
+      <w:r>
+        <w:rPr>
+          <w:lang w:val="en-ZA"/>
+        </w:rPr>
+        <w:t>)</w:t>
+      </w:r>
+    </w:p>
+    <w:p>
+      <w:pPr>
+        <w:pStyle w:val="ListParagraph"/>
+        <w:numPr>
+          <w:ilvl w:val="0"/>
+          <w:numId w:val="1"/>
+        </w:numPr>
+        <w:rPr>
+          <w:lang w:val="en-ZA"/>
+        </w:rPr>
+      </w:pPr>
+      <w:r>
+        <w:rPr>
+          <w:lang w:val="en-ZA"/>
+        </w:rPr>
+        <w:t xml:space="preserve">The checkpoint is deleted once its ownership has passed out of </w:t>
+      </w:r>
       <w:proofErr w:type="gramStart"/>
       <w:r>
         <w:rPr>
           <w:lang w:val="en-ZA"/>
         </w:rPr>
-        <w:t>load(</w:t>
+        <w:t>undo(</w:t>
       </w:r>
       <w:proofErr w:type="gramEnd"/>
       <w:r>
         <w:rPr>
           <w:lang w:val="en-ZA"/>
         </w:rPr>
-        <w:t>) – primitive operation</w:t>
-      </w:r>
-    </w:p>
-    <w:p>
-      <w:pPr>
-        <w:rPr>
-          <w:lang w:val="en-ZA"/>
-        </w:rPr>
-      </w:pPr>
-      <w:r>
-        <w:rPr>
-          <w:lang w:val="en-ZA"/>
-        </w:rPr>
-        <w:t xml:space="preserve">The Factory method created the connector object without the pipeline needing to know which concrete connector class is being used. The template method makes sure that all the pipeline objects follow the same logical sequence/algorithm. They do not overlap </w:t>
-      </w:r>
-      <w:r>
-        <w:rPr>
-          <w:lang w:val="en-ZA"/>
-        </w:rPr>
-        <w:lastRenderedPageBreak/>
-        <w:t xml:space="preserve">because they do not perform the same function. The template method manages the algorithm while the factory class manages object creation. </w:t>
-      </w:r>
+        <w:t xml:space="preserve">), and the run resumes from load() instead of </w:t>
+      </w:r>
+      <w:r>
+        <w:rPr>
+          <w:lang w:val="en-ZA"/>
+        </w:rPr>
+        <w:t>rerunning connect(), extract(), and transform() from scratch.</w:t>
+      </w:r>
+    </w:p>
+    <w:p>
+      <w:pPr>
+        <w:rPr>
+          <w:lang w:val="en-ZA"/>
+        </w:rPr>
+      </w:pPr>
+      <w:r>
+        <w:rPr>
+          <w:lang w:val="en-ZA"/>
+        </w:rPr>
+        <w:t>4.6</w:t>
+      </w:r>
+    </w:p>
+    <w:tbl>
+      <w:tblPr>
+        <w:tblStyle w:val="TableGridLight"/>
+        <w:tblW w:w="0" w:type="auto"/>
+        <w:tblLook w:val="04A0" w:firstRow="1" w:lastRow="0" w:firstColumn="1" w:lastColumn="0" w:noHBand="0" w:noVBand="1"/>
+      </w:tblPr>
+      <w:tblGrid>
+        <w:gridCol w:w="2510"/>
+        <w:gridCol w:w="2165"/>
+        <w:gridCol w:w="4341"/>
+      </w:tblGrid>
+      <w:tr>
+        <w:tc>
+          <w:tcPr>
+            <w:tcW w:w="2510" w:type="dxa"/>
+          </w:tcPr>
+          <w:p>
+            <w:pPr>
+              <w:rPr>
+                <w:lang w:val="en-ZA"/>
+              </w:rPr>
+            </w:pPr>
+          </w:p>
+        </w:tc>
+        <w:tc>
+          <w:tcPr>
+            <w:tcW w:w="2165" w:type="dxa"/>
+          </w:tcPr>
+          <w:p>
+            <w:pPr>
+              <w:rPr>
+                <w:lang w:val="en-ZA"/>
+              </w:rPr>
+            </w:pPr>
+            <w:r>
+              <w:rPr>
+                <w:lang w:val="en-ZA"/>
+              </w:rPr>
+              <w:t>Participant roles</w:t>
+            </w:r>
+          </w:p>
+        </w:tc>
+        <w:tc>
+          <w:tcPr>
+            <w:tcW w:w="4341" w:type="dxa"/>
+          </w:tcPr>
+          <w:p>
+            <w:pPr>
+              <w:rPr>
+                <w:lang w:val="en-ZA"/>
+              </w:rPr>
+            </w:pPr>
+            <w:r>
+              <w:rPr>
+                <w:lang w:val="en-ZA"/>
+              </w:rPr>
+              <w:t>Purpose</w:t>
+            </w:r>
+          </w:p>
+        </w:tc>
+      </w:tr>
+      <w:tr>
+        <w:tc>
+          <w:tcPr>
+            <w:tcW w:w="2510" w:type="dxa"/>
+          </w:tcPr>
+          <w:p>
+            <w:pPr>
+              <w:rPr>
+                <w:lang w:val="en-ZA"/>
+              </w:rPr>
+            </w:pPr>
+            <w:r>
+              <w:rPr>
+                <w:lang w:val="en-ZA"/>
+              </w:rPr>
+              <w:t>Pipeline</w:t>
+            </w:r>
+          </w:p>
+        </w:tc>
+        <w:tc>
+          <w:tcPr>
+            <w:tcW w:w="2165" w:type="dxa"/>
+          </w:tcPr>
+          <w:p>
+            <w:pPr>
+              <w:rPr>
+                <w:lang w:val="en-ZA"/>
+              </w:rPr>
+            </w:pPr>
+            <w:r>
+              <w:rPr>
+                <w:lang w:val="en-ZA"/>
+              </w:rPr>
+              <w:t>Originator</w:t>
+            </w:r>
+          </w:p>
+        </w:tc>
+        <w:tc>
+          <w:tcPr>
+            <w:tcW w:w="4341" w:type="dxa"/>
+          </w:tcPr>
+          <w:p>
+            <w:pPr>
+              <w:rPr>
+                <w:lang w:val="en-ZA"/>
+              </w:rPr>
+            </w:pPr>
+            <w:r>
+              <w:rPr>
+                <w:lang w:val="en-ZA"/>
+              </w:rPr>
+              <w:t>Object with meaningful state, capable of creating and restoring its own snapshots</w:t>
+            </w:r>
+          </w:p>
+        </w:tc>
+      </w:tr>
+      <w:tr>
+        <w:tc>
+          <w:tcPr>
+            <w:tcW w:w="2510" w:type="dxa"/>
+          </w:tcPr>
+          <w:p>
+            <w:pPr>
+              <w:rPr>
+                <w:lang w:val="en-ZA"/>
+              </w:rPr>
+            </w:pPr>
+            <w:proofErr w:type="spellStart"/>
+            <w:r>
+              <w:rPr>
+                <w:lang w:val="en-ZA"/>
+              </w:rPr>
+              <w:t>RunCheckpoint</w:t>
+            </w:r>
+            <w:proofErr w:type="spellEnd"/>
+          </w:p>
+        </w:tc>
+        <w:tc>
+          <w:tcPr>
+            <w:tcW w:w="2165" w:type="dxa"/>
+          </w:tcPr>
+          <w:p>
+            <w:pPr>
+              <w:rPr>
+                <w:lang w:val="en-ZA"/>
+              </w:rPr>
+            </w:pPr>
+            <w:r>
+              <w:rPr>
+                <w:lang w:val="en-ZA"/>
+              </w:rPr>
+              <w:t>Memento</w:t>
+            </w:r>
+          </w:p>
+        </w:tc>
+        <w:tc>
+          <w:tcPr>
+            <w:tcW w:w="4341" w:type="dxa"/>
+          </w:tcPr>
+          <w:p>
+            <w:pPr>
+              <w:rPr>
+                <w:lang w:val="en-ZA"/>
+              </w:rPr>
+            </w:pPr>
+            <w:r>
+              <w:rPr>
+                <w:lang w:val="en-ZA"/>
+              </w:rPr>
+              <w:t>Snapshot holding stage and records</w:t>
+            </w:r>
+          </w:p>
+        </w:tc>
+      </w:tr>
+      <w:tr>
+        <w:tc>
+          <w:tcPr>
+            <w:tcW w:w="2510" w:type="dxa"/>
+          </w:tcPr>
+          <w:p>
+            <w:pPr>
+              <w:rPr>
+                <w:lang w:val="en-ZA"/>
+              </w:rPr>
+            </w:pPr>
+            <w:proofErr w:type="spellStart"/>
+            <w:r>
+              <w:rPr>
+                <w:lang w:val="en-ZA"/>
+              </w:rPr>
+              <w:t>CheckpointManager</w:t>
+            </w:r>
+            <w:proofErr w:type="spellEnd"/>
+          </w:p>
+        </w:tc>
+        <w:tc>
+          <w:tcPr>
+            <w:tcW w:w="2165" w:type="dxa"/>
+          </w:tcPr>
+          <w:p>
+            <w:pPr>
+              <w:rPr>
+                <w:lang w:val="en-ZA"/>
+              </w:rPr>
+            </w:pPr>
+            <w:r>
+              <w:rPr>
+                <w:lang w:val="en-ZA"/>
+              </w:rPr>
+              <w:t>Caretaker</w:t>
+            </w:r>
+          </w:p>
+        </w:tc>
+        <w:tc>
+          <w:tcPr>
+            <w:tcW w:w="4341" w:type="dxa"/>
+          </w:tcPr>
+          <w:p>
+            <w:pPr>
+              <w:rPr>
+                <w:lang w:val="en-ZA"/>
+              </w:rPr>
+            </w:pPr>
+            <w:r>
+              <w:rPr>
+                <w:lang w:val="en-ZA"/>
+              </w:rPr>
+              <w:t>Stores and hands back memento without viewing or modifying contents- related by aggregation</w:t>
+            </w:r>
+            <w:bookmarkStart w:id="0" w:name="_GoBack"/>
+            <w:bookmarkEnd w:id="0"/>
+            <w:r>
+              <w:rPr>
+                <w:lang w:val="en-ZA"/>
+              </w:rPr>
+              <w:t xml:space="preserve"> not ownership.</w:t>
+            </w:r>
+          </w:p>
+        </w:tc>
+      </w:tr>
+    </w:tbl>
+    <w:p>
+      <w:pPr>
+        <w:rPr>
+          <w:lang w:val="en-ZA"/>
+        </w:rPr>
+      </w:pPr>
     </w:p>
     <w:p>
       <w:pPr>
@@ -447,8 +1825,102 @@
 </w:document>
 </file>
 
+<file path=word/numbering.xml><?xml version="1.0" encoding="utf-8"?>
+<w:numbering xmlns:wpc="http://schemas.microsoft.com/office/word/2010/wordprocessingCanvas" xmlns:cx="http://schemas.microsoft.com/office/drawing/2014/chartex" xmlns:mc="http://schemas.openxmlformats.org/markup-compatibility/2006" xmlns:o="urn:schemas-microsoft-com:office:office" xmlns:r="http://schemas.openxmlformats.org/officeDocument/2006/relationships" xmlns:m="http://schemas.openxmlformats.org/officeDocument/2006/math" xmlns:v="urn:schemas-microsoft-com:vml" xmlns:wp14="http://schemas.microsoft.com/office/word/2010/wordprocessingDrawing" xmlns:wp="http://schemas.openxmlformats.org/drawingml/2006/wordprocessingDrawing" xmlns:w10="urn:schemas-microsoft-com:office:word" xmlns:w="http://schemas.openxmlformats.org/wordprocessingml/2006/main" xmlns:w14="http://schemas.microsoft.com/office/word/2010/wordml" xmlns:w15="http://schemas.microsoft.com/office/word/2012/wordml" xmlns:w16se="http://schemas.microsoft.com/office/word/2015/wordml/symex" xmlns:wpg="http://schemas.microsoft.com/office/word/2010/wordprocessingGroup" xmlns:wpi="http://schemas.microsoft.com/office/word/2010/wordprocessingInk" xmlns:wne="http://schemas.microsoft.com/office/word/2006/wordml" xmlns:wps="http://schemas.microsoft.com/office/word/2010/wordprocessingShape" mc:Ignorable="w14 w15 w16se wp14">
+  <w:abstractNum w:abstractNumId="0" w15:restartNumberingAfterBreak="0">
+    <w:nsid w:val="37DA6CB7"/>
+    <w:multiLevelType w:val="hybridMultilevel"/>
+    <w:tmpl w:val="0506EF74"/>
+    <w:lvl w:ilvl="0" w:tplc="0409000F">
+      <w:start w:val="1"/>
+      <w:numFmt w:val="decimal"/>
+      <w:lvlText w:val="%1."/>
+      <w:lvlJc w:val="left"/>
+      <w:pPr>
+        <w:ind w:left="720" w:hanging="360"/>
+      </w:pPr>
+    </w:lvl>
+    <w:lvl w:ilvl="1" w:tplc="04090019" w:tentative="1">
+      <w:start w:val="1"/>
+      <w:numFmt w:val="lowerLetter"/>
+      <w:lvlText w:val="%2."/>
+      <w:lvlJc w:val="left"/>
+      <w:pPr>
+        <w:ind w:left="1440" w:hanging="360"/>
+      </w:pPr>
+    </w:lvl>
+    <w:lvl w:ilvl="2" w:tplc="0409001B" w:tentative="1">
+      <w:start w:val="1"/>
+      <w:numFmt w:val="lowerRoman"/>
+      <w:lvlText w:val="%3."/>
+      <w:lvlJc w:val="right"/>
+      <w:pPr>
+        <w:ind w:left="2160" w:hanging="180"/>
+      </w:pPr>
+    </w:lvl>
+    <w:lvl w:ilvl="3" w:tplc="0409000F" w:tentative="1">
+      <w:start w:val="1"/>
+      <w:numFmt w:val="decimal"/>
+      <w:lvlText w:val="%4."/>
+      <w:lvlJc w:val="left"/>
+      <w:pPr>
+        <w:ind w:left="2880" w:hanging="360"/>
+      </w:pPr>
+    </w:lvl>
+    <w:lvl w:ilvl="4" w:tplc="04090019" w:tentative="1">
+      <w:start w:val="1"/>
+      <w:numFmt w:val="lowerLetter"/>
+      <w:lvlText w:val="%5."/>
+      <w:lvlJc w:val="left"/>
+      <w:pPr>
+        <w:ind w:left="3600" w:hanging="360"/>
+      </w:pPr>
+    </w:lvl>
+    <w:lvl w:ilvl="5" w:tplc="0409001B" w:tentative="1">
+      <w:start w:val="1"/>
+      <w:numFmt w:val="lowerRoman"/>
+      <w:lvlText w:val="%6."/>
+      <w:lvlJc w:val="right"/>
+      <w:pPr>
+        <w:ind w:left="4320" w:hanging="180"/>
+      </w:pPr>
+    </w:lvl>
+    <w:lvl w:ilvl="6" w:tplc="0409000F" w:tentative="1">
+      <w:start w:val="1"/>
+      <w:numFmt w:val="decimal"/>
+      <w:lvlText w:val="%7."/>
+      <w:lvlJc w:val="left"/>
+      <w:pPr>
+        <w:ind w:left="5040" w:hanging="360"/>
+      </w:pPr>
+    </w:lvl>
+    <w:lvl w:ilvl="7" w:tplc="04090019" w:tentative="1">
+      <w:start w:val="1"/>
+      <w:numFmt w:val="lowerLetter"/>
+      <w:lvlText w:val="%8."/>
+      <w:lvlJc w:val="left"/>
+      <w:pPr>
+        <w:ind w:left="5760" w:hanging="360"/>
+      </w:pPr>
+    </w:lvl>
+    <w:lvl w:ilvl="8" w:tplc="0409001B" w:tentative="1">
+      <w:start w:val="1"/>
+      <w:numFmt w:val="lowerRoman"/>
+      <w:lvlText w:val="%9."/>
+      <w:lvlJc w:val="right"/>
+      <w:pPr>
+        <w:ind w:left="6480" w:hanging="180"/>
+      </w:pPr>
+    </w:lvl>
+  </w:abstractNum>
+  <w:num w:numId="1">
+    <w:abstractNumId w:val="0"/>
+  </w:num>
+</w:numbering>
+</file>
+
 <file path=word/styles.xml><?xml version="1.0" encoding="utf-8"?>
-<w:styles xmlns:mc="http://schemas.openxmlformats.org/markup-compatibility/2006" xmlns:r="http://schemas.openxmlformats.org/officeDocument/2006/relationships" xmlns:w="http://schemas.openxmlformats.org/wordprocessingml/2006/main" xmlns:w14="http://schemas.microsoft.com/office/word/2010/wordml" xmlns:w15="http://schemas.microsoft.com/office/word/2012/wordml" xmlns:w16cex="http://schemas.microsoft.com/office/word/2018/wordml/cex" xmlns:w16cid="http://schemas.microsoft.com/office/word/2016/wordml/cid" xmlns:w16="http://schemas.microsoft.com/office/word/2018/wordml" xmlns:w16du="http://schemas.microsoft.com/office/word/2023/wordml/word16du" xmlns:w16sdtdh="http://schemas.microsoft.com/office/word/2020/wordml/sdtdatahash" xmlns:w16sdtfl="http://schemas.microsoft.com/office/word/2024/wordml/sdtformatlock" xmlns:w16se="http://schemas.microsoft.com/office/word/2015/wordml/symex" mc:Ignorable="w14 w15 w16se w16cid w16 w16cex w16sdtdh w16sdtfl w16du">
+<w:styles xmlns:mc="http://schemas.openxmlformats.org/markup-compatibility/2006" xmlns:r="http://schemas.openxmlformats.org/officeDocument/2006/relationships" xmlns:w="http://schemas.openxmlformats.org/wordprocessingml/2006/main" xmlns:w14="http://schemas.microsoft.com/office/word/2010/wordml" xmlns:w15="http://schemas.microsoft.com/office/word/2012/wordml" xmlns:w16se="http://schemas.microsoft.com/office/word/2015/wordml/symex" mc:Ignorable="w14 w15 w16se">
   <w:docDefaults>
     <w:rPrDefault>
       <w:rPr>
@@ -466,7 +1938,7 @@
       </w:pPr>
     </w:pPrDefault>
   </w:docDefaults>
-  <w:latentStyles w:defLockedState="0" w:defUIPriority="99" w:defSemiHidden="0" w:defUnhideWhenUsed="0" w:defQFormat="0" w:count="376">
+  <w:latentStyles w:defLockedState="0" w:defUIPriority="99" w:defSemiHidden="0" w:defUnhideWhenUsed="0" w:defQFormat="0" w:count="371">
     <w:lsdException w:name="Normal" w:uiPriority="0" w:qFormat="1"/>
     <w:lsdException w:name="heading 1" w:uiPriority="9" w:qFormat="1"/>
     <w:lsdException w:name="heading 2" w:semiHidden="1" w:uiPriority="9" w:unhideWhenUsed="1" w:qFormat="1"/>
@@ -838,11 +2310,6 @@
     <w:lsdException w:name="List Table 5 Dark Accent 6" w:uiPriority="50"/>
     <w:lsdException w:name="List Table 6 Colorful Accent 6" w:uiPriority="51"/>
     <w:lsdException w:name="List Table 7 Colorful Accent 6" w:uiPriority="52"/>
-    <w:lsdException w:name="Mention" w:semiHidden="1" w:unhideWhenUsed="1"/>
-    <w:lsdException w:name="Smart Hyperlink" w:semiHidden="1" w:unhideWhenUsed="1"/>
-    <w:lsdException w:name="Hashtag" w:semiHidden="1" w:unhideWhenUsed="1"/>
-    <w:lsdException w:name="Unresolved Mention" w:semiHidden="1" w:unhideWhenUsed="1"/>
-    <w:lsdException w:name="Smart Link" w:semiHidden="1" w:unhideWhenUsed="1"/>
   </w:latentStyles>
   <w:style w:type="paragraph" w:default="1" w:styleId="Normal">
     <w:name w:val="Normal"/>
@@ -1050,6 +2517,7 @@
   <w:style w:type="character" w:default="1" w:styleId="DefaultParagraphFont">
     <w:name w:val="Default Paragraph Font"/>
     <w:uiPriority w:val="1"/>
+    <w:semiHidden/>
     <w:unhideWhenUsed/>
   </w:style>
   <w:style w:type="table" w:default="1" w:styleId="TableNormal">
@@ -1362,6 +2830,107 @@
       <w:color w:val="0F4761" w:themeColor="accent1" w:themeShade="BF"/>
       <w:spacing w:val="5"/>
     </w:rPr>
+  </w:style>
+  <w:style w:type="table" w:styleId="TableGrid">
+    <w:name w:val="Table Grid"/>
+    <w:basedOn w:val="TableNormal"/>
+    <w:uiPriority w:val="39"/>
+    <w:rsid w:val="004B5F17"/>
+    <w:pPr>
+      <w:spacing w:after="0" w:line="240" w:lineRule="auto"/>
+    </w:pPr>
+    <w:tblPr>
+      <w:tblBorders>
+        <w:top w:val="single" w:sz="4" w:space="0" w:color="auto"/>
+        <w:left w:val="single" w:sz="4" w:space="0" w:color="auto"/>
+        <w:bottom w:val="single" w:sz="4" w:space="0" w:color="auto"/>
+        <w:right w:val="single" w:sz="4" w:space="0" w:color="auto"/>
+        <w:insideH w:val="single" w:sz="4" w:space="0" w:color="auto"/>
+        <w:insideV w:val="single" w:sz="4" w:space="0" w:color="auto"/>
+      </w:tblBorders>
+    </w:tblPr>
+  </w:style>
+  <w:style w:type="table" w:styleId="TableGridLight">
+    <w:name w:val="Grid Table Light"/>
+    <w:basedOn w:val="TableNormal"/>
+    <w:uiPriority w:val="40"/>
+    <w:rsid w:val="00ED5168"/>
+    <w:pPr>
+      <w:spacing w:after="0" w:line="240" w:lineRule="auto"/>
+    </w:pPr>
+    <w:tblPr>
+      <w:tblBorders>
+        <w:top w:val="single" w:sz="4" w:space="0" w:color="BFBFBF" w:themeColor="background1" w:themeShade="BF"/>
+        <w:left w:val="single" w:sz="4" w:space="0" w:color="BFBFBF" w:themeColor="background1" w:themeShade="BF"/>
+        <w:bottom w:val="single" w:sz="4" w:space="0" w:color="BFBFBF" w:themeColor="background1" w:themeShade="BF"/>
+        <w:right w:val="single" w:sz="4" w:space="0" w:color="BFBFBF" w:themeColor="background1" w:themeShade="BF"/>
+        <w:insideH w:val="single" w:sz="4" w:space="0" w:color="BFBFBF" w:themeColor="background1" w:themeShade="BF"/>
+        <w:insideV w:val="single" w:sz="4" w:space="0" w:color="BFBFBF" w:themeColor="background1" w:themeShade="BF"/>
+      </w:tblBorders>
+    </w:tblPr>
+  </w:style>
+  <w:style w:type="table" w:styleId="PlainTable1">
+    <w:name w:val="Plain Table 1"/>
+    <w:basedOn w:val="TableNormal"/>
+    <w:uiPriority w:val="41"/>
+    <w:rsid w:val="00ED5168"/>
+    <w:pPr>
+      <w:spacing w:after="0" w:line="240" w:lineRule="auto"/>
+    </w:pPr>
+    <w:tblPr>
+      <w:tblStyleRowBandSize w:val="1"/>
+      <w:tblStyleColBandSize w:val="1"/>
+      <w:tblBorders>
+        <w:top w:val="single" w:sz="4" w:space="0" w:color="BFBFBF" w:themeColor="background1" w:themeShade="BF"/>
+        <w:left w:val="single" w:sz="4" w:space="0" w:color="BFBFBF" w:themeColor="background1" w:themeShade="BF"/>
+        <w:bottom w:val="single" w:sz="4" w:space="0" w:color="BFBFBF" w:themeColor="background1" w:themeShade="BF"/>
+        <w:right w:val="single" w:sz="4" w:space="0" w:color="BFBFBF" w:themeColor="background1" w:themeShade="BF"/>
+        <w:insideH w:val="single" w:sz="4" w:space="0" w:color="BFBFBF" w:themeColor="background1" w:themeShade="BF"/>
+        <w:insideV w:val="single" w:sz="4" w:space="0" w:color="BFBFBF" w:themeColor="background1" w:themeShade="BF"/>
+      </w:tblBorders>
+    </w:tblPr>
+    <w:tblStylePr w:type="firstRow">
+      <w:rPr>
+        <w:b/>
+        <w:bCs/>
+      </w:rPr>
+    </w:tblStylePr>
+    <w:tblStylePr w:type="lastRow">
+      <w:rPr>
+        <w:b/>
+        <w:bCs/>
+      </w:rPr>
+      <w:tblPr/>
+      <w:tcPr>
+        <w:tcBorders>
+          <w:top w:val="double" w:sz="4" w:space="0" w:color="BFBFBF" w:themeColor="background1" w:themeShade="BF"/>
+        </w:tcBorders>
+      </w:tcPr>
+    </w:tblStylePr>
+    <w:tblStylePr w:type="firstCol">
+      <w:rPr>
+        <w:b/>
+        <w:bCs/>
+      </w:rPr>
+    </w:tblStylePr>
+    <w:tblStylePr w:type="lastCol">
+      <w:rPr>
+        <w:b/>
+        <w:bCs/>
+      </w:rPr>
+    </w:tblStylePr>
+    <w:tblStylePr w:type="band1Vert">
+      <w:tblPr/>
+      <w:tcPr>
+        <w:shd w:val="clear" w:color="auto" w:fill="F2F2F2" w:themeFill="background1" w:themeFillShade="F2"/>
+      </w:tcPr>
+    </w:tblStylePr>
+    <w:tblStylePr w:type="band1Horz">
+      <w:tblPr/>
+      <w:tcPr>
+        <w:shd w:val="clear" w:color="auto" w:fill="F2F2F2" w:themeFill="background1" w:themeFillShade="F2"/>
+      </w:tcPr>
+    </w:tblStylePr>
   </w:style>
 </w:styles>
 </file>

</xml_diff>

<commit_message>
Commiting updated pdf answers
</commit_message>
<xml_diff>
--- a/pdf.docx
+++ b/pdf.docx
@@ -25,7 +25,7 @@
         <w:rPr>
           <w:lang w:val="en-ZA"/>
         </w:rPr>
-        <w:t xml:space="preserve">1.5 </w:t>
+        <w:t>1.5</w:t>
       </w:r>
     </w:p>
     <w:p>
@@ -44,7 +44,6 @@
       <w:proofErr w:type="gramStart"/>
       <w:r>
         <w:rPr>
-          <w:i/>
           <w:lang w:val="en-ZA"/>
         </w:rPr>
         <w:t>createConnector</w:t>
@@ -52,7 +51,6 @@
       <w:proofErr w:type="spellEnd"/>
       <w:r>
         <w:rPr>
-          <w:i/>
           <w:lang w:val="en-ZA"/>
         </w:rPr>
         <w:t>(</w:t>
@@ -60,106 +58,26 @@
       <w:proofErr w:type="gramEnd"/>
       <w:r>
         <w:rPr>
-          <w:i/>
-          <w:lang w:val="en-ZA"/>
-        </w:rPr>
-        <w:t>string kind)</w:t>
-      </w:r>
-      <w:r>
-        <w:rPr>
-          <w:lang w:val="en-ZA"/>
-        </w:rPr>
-        <w:t xml:space="preserve"> function with an if/else chain means the function has to know about every connector type that exists, and every time Kudu Freight </w:t>
-      </w:r>
-      <w:proofErr w:type="spellStart"/>
-      <w:r>
-        <w:rPr>
-          <w:lang w:val="en-ZA"/>
-        </w:rPr>
-        <w:t>onboards</w:t>
-      </w:r>
-      <w:proofErr w:type="spellEnd"/>
-      <w:r>
-        <w:rPr>
-          <w:lang w:val="en-ZA"/>
-        </w:rPr>
-        <w:t xml:space="preserve"> a new data source, a developer has to go back into that already-working function and add another branch. </w:t>
-      </w:r>
-      <w:r>
-        <w:rPr>
-          <w:lang w:val="en-ZA"/>
-        </w:rPr>
-        <w:t xml:space="preserve">That function is never closed it must be modified </w:t>
-      </w:r>
-      <w:r>
-        <w:rPr>
-          <w:lang w:val="en-ZA"/>
-        </w:rPr>
-        <w:t>for ev</w:t>
-      </w:r>
-      <w:r>
-        <w:rPr>
-          <w:lang w:val="en-ZA"/>
-        </w:rPr>
-        <w:t>ery new source, which is</w:t>
-      </w:r>
-      <w:r>
-        <w:rPr>
-          <w:lang w:val="en-ZA"/>
-        </w:rPr>
-        <w:t xml:space="preserve"> what the open</w:t>
-      </w:r>
-      <w:r>
-        <w:rPr>
-          <w:lang w:val="en-ZA"/>
-        </w:rPr>
-        <w:t>-closed principle warns against- the</w:t>
-      </w:r>
-      <w:r>
-        <w:rPr>
-          <w:lang w:val="en-ZA"/>
-        </w:rPr>
-        <w:t xml:space="preserve"> code should be open to extension but closed to modification.</w:t>
-      </w:r>
-    </w:p>
-    <w:p>
-      <w:pPr>
-        <w:rPr>
-          <w:lang w:val="en-ZA"/>
-        </w:rPr>
-      </w:pPr>
-      <w:r>
-        <w:rPr>
-          <w:lang w:val="en-ZA"/>
-        </w:rPr>
-        <w:t xml:space="preserve">The </w:t>
-      </w:r>
-      <w:r>
-        <w:rPr>
-          <w:lang w:val="en-ZA"/>
-        </w:rPr>
-        <w:t xml:space="preserve">Factory Method solves this by moving the decision into the type system instead of a conditional. </w:t>
-      </w:r>
-      <w:proofErr w:type="spellStart"/>
-      <w:r>
-        <w:rPr>
-          <w:i/>
-          <w:lang w:val="en-ZA"/>
-        </w:rPr>
-        <w:t>ConnectorFactory</w:t>
-      </w:r>
-      <w:proofErr w:type="spellEnd"/>
-      <w:r>
-        <w:rPr>
-          <w:lang w:val="en-ZA"/>
-        </w:rPr>
-        <w:t xml:space="preserve"> declares </w:t>
+          <w:lang w:val="en-ZA"/>
+        </w:rPr>
+        <w:t>s</w:t>
+      </w:r>
+      <w:r>
+        <w:rPr>
+          <w:lang w:val="en-ZA"/>
+        </w:rPr>
+        <w:t>tring kind) function with an if/</w:t>
+      </w:r>
+      <w:r>
+        <w:rPr>
+          <w:lang w:val="en-ZA"/>
+        </w:rPr>
+        <w:t xml:space="preserve">else chain means the function must know about every connector type that exists. Every time Kudu Freight adds a new data source or connector, a developer must modify the existing </w:t>
       </w:r>
       <w:proofErr w:type="spellStart"/>
       <w:proofErr w:type="gramStart"/>
       <w:r>
         <w:rPr>
-          <w:i/>
           <w:lang w:val="en-ZA"/>
         </w:rPr>
         <w:t>createConnector</w:t>
@@ -167,7 +85,6 @@
       <w:proofErr w:type="spellEnd"/>
       <w:r>
         <w:rPr>
-          <w:i/>
           <w:lang w:val="en-ZA"/>
         </w:rPr>
         <w:t>(</w:t>
@@ -175,34 +92,41 @@
       <w:proofErr w:type="gramEnd"/>
       <w:r>
         <w:rPr>
-          <w:i/>
-          <w:lang w:val="en-ZA"/>
-        </w:rPr>
-        <w:t>)</w:t>
-      </w:r>
-      <w:r>
-        <w:rPr>
-          <w:lang w:val="en-ZA"/>
-        </w:rPr>
-        <w:t xml:space="preserve"> withou</w:t>
-      </w:r>
-      <w:r>
-        <w:rPr>
-          <w:lang w:val="en-ZA"/>
-        </w:rPr>
-        <w:t xml:space="preserve">t saying which class it returns, each concrete factory </w:t>
-      </w:r>
-      <w:r>
-        <w:rPr>
-          <w:lang w:val="en-ZA"/>
-        </w:rPr>
-        <w:t xml:space="preserve">overrides it to return its own matching connector. Adding a new source </w:t>
-      </w:r>
-      <w:r>
-        <w:rPr>
-          <w:lang w:val="en-ZA"/>
-        </w:rPr>
-        <w:t xml:space="preserve">means writing one new Connector, </w:t>
+          <w:lang w:val="en-ZA"/>
+        </w:rPr>
+        <w:t xml:space="preserve">) function to add another if or else if case. This violates the </w:t>
+      </w:r>
+      <w:r>
+        <w:rPr>
+          <w:b/>
+          <w:lang w:val="en-ZA"/>
+        </w:rPr>
+        <w:t>Open-Closed Principle</w:t>
+      </w:r>
+      <w:r>
+        <w:rPr>
+          <w:lang w:val="en-ZA"/>
+        </w:rPr>
+        <w:t>, which states that software should be open for extension but closed for modification, because the existing function must be changed whenever</w:t>
+      </w:r>
+      <w:r>
+        <w:rPr>
+          <w:lang w:val="en-ZA"/>
+        </w:rPr>
+        <w:t xml:space="preserve"> a new connector is introduced.</w:t>
+      </w:r>
+    </w:p>
+    <w:p>
+      <w:pPr>
+        <w:rPr>
+          <w:lang w:val="en-ZA"/>
+        </w:rPr>
+      </w:pPr>
+      <w:r>
+        <w:rPr>
+          <w:lang w:val="en-ZA"/>
+        </w:rPr>
+        <w:t xml:space="preserve">The Factory Method Pattern follows the Open-Closed Principle by separating object creation into different factory classes. The abstract </w:t>
       </w:r>
       <w:proofErr w:type="spellStart"/>
       <w:r>
@@ -216,25 +140,126 @@
         <w:rPr>
           <w:lang w:val="en-ZA"/>
         </w:rPr>
-        <w:t xml:space="preserve"> pair (new pair of files) </w:t>
-      </w:r>
-      <w:r>
-        <w:rPr>
-          <w:lang w:val="en-ZA"/>
-        </w:rPr>
-        <w:t xml:space="preserve">and touching nothing that already compiles and works. The rest of the program, which only ever holds </w:t>
-      </w:r>
-      <w:r>
-        <w:rPr>
-          <w:i/>
-          <w:lang w:val="en-ZA"/>
-        </w:rPr>
-        <w:t xml:space="preserve">a </w:t>
+        <w:t xml:space="preserve"> declares the factory method </w:t>
       </w:r>
       <w:proofErr w:type="spellStart"/>
-      <w:r>
-        <w:rPr>
-          <w:i/>
+      <w:proofErr w:type="gramStart"/>
+      <w:r>
+        <w:rPr>
+          <w:lang w:val="en-ZA"/>
+        </w:rPr>
+        <w:t>createConnector</w:t>
+      </w:r>
+      <w:proofErr w:type="spellEnd"/>
+      <w:r>
+        <w:rPr>
+          <w:lang w:val="en-ZA"/>
+        </w:rPr>
+        <w:t>(</w:t>
+      </w:r>
+      <w:proofErr w:type="gramEnd"/>
+      <w:r>
+        <w:rPr>
+          <w:lang w:val="en-ZA"/>
+        </w:rPr>
+        <w:t>) without specifying which concrete connector will be created</w:t>
+      </w:r>
+      <w:r>
+        <w:rPr>
+          <w:lang w:val="en-ZA"/>
+        </w:rPr>
+        <w:t>. Each concrete factory</w:t>
+      </w:r>
+      <w:r>
+        <w:rPr>
+          <w:lang w:val="en-ZA"/>
+        </w:rPr>
+        <w:t xml:space="preserve"> </w:t>
+      </w:r>
+      <w:r>
+        <w:rPr>
+          <w:lang w:val="en-ZA"/>
+        </w:rPr>
+        <w:t>(</w:t>
+      </w:r>
+      <w:proofErr w:type="spellStart"/>
+      <w:r>
+        <w:rPr>
+          <w:lang w:val="en-ZA"/>
+        </w:rPr>
+        <w:t>CsvFactory</w:t>
+      </w:r>
+      <w:proofErr w:type="spellEnd"/>
+      <w:r>
+        <w:rPr>
+          <w:lang w:val="en-ZA"/>
+        </w:rPr>
+        <w:t xml:space="preserve">, </w:t>
+      </w:r>
+      <w:proofErr w:type="spellStart"/>
+      <w:proofErr w:type="gramStart"/>
+      <w:r>
+        <w:rPr>
+          <w:lang w:val="en-ZA"/>
+        </w:rPr>
+        <w:t>Post</w:t>
+      </w:r>
+      <w:r>
+        <w:rPr>
+          <w:lang w:val="en-ZA"/>
+        </w:rPr>
+        <w:t>gresFactory,RestApiFactory</w:t>
+      </w:r>
+      <w:proofErr w:type="spellEnd"/>
+      <w:proofErr w:type="gramEnd"/>
+      <w:r>
+        <w:rPr>
+          <w:lang w:val="en-ZA"/>
+        </w:rPr>
+        <w:t xml:space="preserve">) </w:t>
+      </w:r>
+      <w:r>
+        <w:rPr>
+          <w:lang w:val="en-ZA"/>
+        </w:rPr>
+        <w:t xml:space="preserve">overrides </w:t>
+      </w:r>
+      <w:proofErr w:type="spellStart"/>
+      <w:r>
+        <w:rPr>
+          <w:lang w:val="en-ZA"/>
+        </w:rPr>
+        <w:t>createConnector</w:t>
+      </w:r>
+      <w:proofErr w:type="spellEnd"/>
+      <w:r>
+        <w:rPr>
+          <w:lang w:val="en-ZA"/>
+        </w:rPr>
+        <w:t xml:space="preserve">() to return its corresponding concrete connector. </w:t>
+      </w:r>
+      <w:r>
+        <w:rPr>
+          <w:b/>
+          <w:lang w:val="en-ZA"/>
+        </w:rPr>
+        <w:t>If a new connector is required, a new concrete connector and a matching concrete factory can simply be added without modifying any existing classes</w:t>
+      </w:r>
+      <w:r>
+        <w:rPr>
+          <w:lang w:val="en-ZA"/>
+        </w:rPr>
+        <w:t>. The system is then</w:t>
+      </w:r>
+      <w:r>
+        <w:rPr>
+          <w:lang w:val="en-ZA"/>
+        </w:rPr>
+        <w:t xml:space="preserve"> easier to maintain, extend, and test. It also reduces coupling because the client depends only on the abstract </w:t>
+      </w:r>
+      <w:proofErr w:type="spellStart"/>
+      <w:r>
+        <w:rPr>
           <w:lang w:val="en-ZA"/>
         </w:rPr>
         <w:t>ConnectorFactory</w:t>
@@ -242,17 +267,17 @@
       <w:proofErr w:type="spellEnd"/>
       <w:r>
         <w:rPr>
-          <w:i/>
-          <w:lang w:val="en-ZA"/>
-        </w:rPr>
-        <w:t>*</w:t>
-      </w:r>
-      <w:r>
-        <w:rPr>
-          <w:lang w:val="en-ZA"/>
-        </w:rPr>
-        <w:t>, doesn't even need to be recompiled. Extension happens by adding a class, not editing an existing one.</w:t>
-      </w:r>
+          <w:lang w:val="en-ZA"/>
+        </w:rPr>
+        <w:t xml:space="preserve"> and Connector interfaces rather than concrete connector classes.</w:t>
+      </w:r>
+    </w:p>
+    <w:p>
+      <w:pPr>
+        <w:rPr>
+          <w:lang w:val="en-ZA"/>
+        </w:rPr>
+      </w:pPr>
     </w:p>
     <w:p>
       <w:pPr>
@@ -333,7 +358,7 @@
                 <w:i/>
                 <w:lang w:val="en-ZA"/>
               </w:rPr>
-              <w:t>Purpose</w:t>
+              <w:t>Reason</w:t>
             </w:r>
           </w:p>
         </w:tc>
@@ -395,7 +420,7 @@
               <w:rPr>
                 <w:lang w:val="en-ZA"/>
               </w:rPr>
-              <w:t>Defines the interface the factory method returns</w:t>
+              <w:t>It is the abstract class that defines the interface (extract()) for all connector objects.</w:t>
             </w:r>
           </w:p>
         </w:tc>
@@ -464,7 +489,19 @@
               <w:rPr>
                 <w:lang w:val="en-ZA"/>
               </w:rPr>
-              <w:t>Implements that interface with concrete behaviour</w:t>
+              <w:t>It implements the Connecto</w:t>
+            </w:r>
+            <w:r>
+              <w:rPr>
+                <w:lang w:val="en-ZA"/>
+              </w:rPr>
+              <w:t>r interface and provides the Csv</w:t>
+            </w:r>
+            <w:r>
+              <w:rPr>
+                <w:lang w:val="en-ZA"/>
+              </w:rPr>
+              <w:t>-specific implementation of extract().</w:t>
             </w:r>
           </w:p>
         </w:tc>
@@ -528,7 +565,21 @@
               <w:rPr>
                 <w:lang w:val="en-ZA"/>
               </w:rPr>
-              <w:t>Declares the factory method without committing to a concrete return type.</w:t>
+              <w:t xml:space="preserve">It declares the factory method </w:t>
+            </w:r>
+            <w:proofErr w:type="spellStart"/>
+            <w:r>
+              <w:rPr>
+                <w:lang w:val="en-ZA"/>
+              </w:rPr>
+              <w:t>createConnector</w:t>
+            </w:r>
+            <w:proofErr w:type="spellEnd"/>
+            <w:r>
+              <w:rPr>
+                <w:lang w:val="en-ZA"/>
+              </w:rPr>
+              <w:t>() that returns a Connector.</w:t>
             </w:r>
           </w:p>
         </w:tc>
@@ -591,16 +642,68 @@
               <w:rPr>
                 <w:lang w:val="en-ZA"/>
               </w:rPr>
-              <w:t xml:space="preserve">Overrides the factory method to return a specific </w:t>
+              <w:t xml:space="preserve">Overrides </w:t>
             </w:r>
             <w:proofErr w:type="spellStart"/>
             <w:r>
               <w:rPr>
                 <w:lang w:val="en-ZA"/>
               </w:rPr>
+              <w:t>createConnector</w:t>
+            </w:r>
+            <w:proofErr w:type="spellEnd"/>
+            <w:r>
+              <w:rPr>
+                <w:lang w:val="en-ZA"/>
+              </w:rPr>
+              <w:t>()</w:t>
+            </w:r>
+            <w:r>
+              <w:rPr>
+                <w:lang w:val="en-ZA"/>
+              </w:rPr>
+              <w:t xml:space="preserve"> (the factory meth</w:t>
+            </w:r>
+            <w:r>
+              <w:rPr>
+                <w:lang w:val="en-ZA"/>
+              </w:rPr>
+              <w:t>od</w:t>
+            </w:r>
+            <w:r>
+              <w:rPr>
+                <w:lang w:val="en-ZA"/>
+              </w:rPr>
+              <w:t xml:space="preserve">) to return a new </w:t>
+            </w:r>
+            <w:proofErr w:type="spellStart"/>
+            <w:r>
+              <w:rPr>
+                <w:lang w:val="en-ZA"/>
+              </w:rPr>
+              <w:t>CsvConnector</w:t>
+            </w:r>
+            <w:proofErr w:type="spellEnd"/>
+            <w:r>
+              <w:rPr>
+                <w:lang w:val="en-ZA"/>
+              </w:rPr>
+              <w:t xml:space="preserve"> (</w:t>
+            </w:r>
+            <w:proofErr w:type="spellStart"/>
+            <w:r>
+              <w:rPr>
+                <w:lang w:val="en-ZA"/>
+              </w:rPr>
               <w:t>ConcreteProduct</w:t>
             </w:r>
             <w:proofErr w:type="spellEnd"/>
+            <w:r>
+              <w:rPr>
+                <w:lang w:val="en-ZA"/>
+              </w:rPr>
+              <w:t>)</w:t>
+            </w:r>
             <w:r>
               <w:rPr>
                 <w:lang w:val="en-ZA"/>
@@ -631,10 +734,32 @@
           <w:lang w:val="en-ZA"/>
         </w:rPr>
       </w:pPr>
-      <w:r>
-        <w:rPr>
-          <w:lang w:val="en-ZA"/>
-        </w:rPr>
+    </w:p>
+    <w:p>
+      <w:pPr>
+        <w:rPr>
+          <w:lang w:val="en-ZA"/>
+        </w:rPr>
+      </w:pPr>
+    </w:p>
+    <w:p>
+      <w:pPr>
+        <w:rPr>
+          <w:lang w:val="en-ZA"/>
+        </w:rPr>
+      </w:pPr>
+    </w:p>
+    <w:p>
+      <w:pPr>
+        <w:rPr>
+          <w:lang w:val="en-ZA"/>
+        </w:rPr>
+      </w:pPr>
+      <w:r>
+        <w:rPr>
+          <w:lang w:val="en-ZA"/>
+        </w:rPr>
+        <w:lastRenderedPageBreak/>
         <w:t xml:space="preserve">Task 2 </w:t>
       </w:r>
     </w:p>
@@ -759,84 +884,378 @@
         <w:rPr>
           <w:lang w:val="en-ZA"/>
         </w:rPr>
-        <w:t xml:space="preserve">)s rather than the stored pointer because if they shared the same prototype object, if one pipeline modified the transformation’s state, the </w:t>
-      </w:r>
+        <w:t>)s rather than the stored pointer because if they shared the same prototype object, if one pipeline modified the transformation’s state, the other pipeline would be affected. This could lead to issues such as dangling pointers and double deletion. Returning clones gives both pipelines their own separate copy to avoid these issues.</w:t>
+      </w:r>
+    </w:p>
+    <w:p>
+      <w:pPr>
+        <w:rPr>
+          <w:lang w:val="en-ZA"/>
+        </w:rPr>
+      </w:pPr>
+      <w:r>
+        <w:rPr>
+          <w:lang w:val="en-ZA"/>
+        </w:rPr>
+        <w:t xml:space="preserve">Task 3 </w:t>
+      </w:r>
+    </w:p>
+    <w:p>
+      <w:pPr>
+        <w:rPr>
+          <w:lang w:val="en-ZA"/>
+        </w:rPr>
+      </w:pPr>
+      <w:r>
+        <w:rPr>
+          <w:lang w:val="en-ZA"/>
+        </w:rPr>
+        <w:t>3.5</w:t>
+      </w:r>
+    </w:p>
+    <w:p>
+      <w:pPr>
+        <w:rPr>
+          <w:lang w:val="en-ZA"/>
+        </w:rPr>
+      </w:pPr>
+      <w:proofErr w:type="gramStart"/>
+      <w:r>
+        <w:rPr>
+          <w:lang w:val="en-ZA"/>
+        </w:rPr>
+        <w:t>run(</w:t>
+      </w:r>
+      <w:proofErr w:type="gramEnd"/>
+      <w:r>
+        <w:rPr>
+          <w:lang w:val="en-ZA"/>
+        </w:rPr>
+        <w:t>) is deliberately not virtual because it specifies the specific order in which connect(),extract(), transform() and load() should be executed in each subclass. If the subclasses could override it, this could lead to some of the functions not be executed at all or in the wrong order.</w:t>
+      </w:r>
+      <w:r>
+        <w:t xml:space="preserve"> </w:t>
+      </w:r>
+      <w:r>
+        <w:rPr>
+          <w:lang w:val="en-ZA"/>
+        </w:rPr>
+        <w:t xml:space="preserve">Making </w:t>
+      </w:r>
+      <w:proofErr w:type="gramStart"/>
+      <w:r>
+        <w:rPr>
+          <w:lang w:val="en-ZA"/>
+        </w:rPr>
+        <w:t>run(</w:t>
+      </w:r>
+      <w:proofErr w:type="gramEnd"/>
+      <w:r>
+        <w:rPr>
+          <w:lang w:val="en-ZA"/>
+        </w:rPr>
+        <w:t>) non-virtual guarantees that every pipeline follows the same processing sequence</w:t>
+      </w:r>
+      <w:r>
+        <w:rPr>
+          <w:lang w:val="en-ZA"/>
+        </w:rPr>
+        <w:t>.</w:t>
+      </w:r>
+    </w:p>
+    <w:p>
+      <w:pPr>
+        <w:rPr>
+          <w:lang w:val="en-ZA"/>
+        </w:rPr>
+      </w:pPr>
+    </w:p>
+    <w:p>
+      <w:pPr>
+        <w:rPr>
+          <w:lang w:val="en-ZA"/>
+        </w:rPr>
+      </w:pPr>
+      <w:r>
+        <w:rPr>
+          <w:lang w:val="en-ZA"/>
+        </w:rPr>
+        <w:t>3.6</w:t>
+      </w:r>
+    </w:p>
+    <w:p>
+      <w:pPr>
+        <w:rPr>
+          <w:lang w:val="en-ZA"/>
+        </w:rPr>
+      </w:pPr>
+      <w:proofErr w:type="gramStart"/>
+      <w:r>
+        <w:rPr>
+          <w:lang w:val="en-ZA"/>
+        </w:rPr>
+        <w:t>run(</w:t>
+      </w:r>
+      <w:proofErr w:type="gramEnd"/>
+      <w:r>
+        <w:rPr>
+          <w:lang w:val="en-ZA"/>
+        </w:rPr>
+        <w:t>)- template method,</w:t>
+      </w:r>
+    </w:p>
+    <w:p>
+      <w:pPr>
+        <w:rPr>
+          <w:lang w:val="en-ZA"/>
+        </w:rPr>
+      </w:pPr>
+      <w:proofErr w:type="gramStart"/>
+      <w:r>
+        <w:rPr>
+          <w:lang w:val="en-ZA"/>
+        </w:rPr>
+        <w:t>connect(</w:t>
+      </w:r>
+      <w:proofErr w:type="gramEnd"/>
+      <w:r>
+        <w:rPr>
+          <w:lang w:val="en-ZA"/>
+        </w:rPr>
+        <w:t>)- concrete step</w:t>
+      </w:r>
+    </w:p>
+    <w:p>
+      <w:pPr>
+        <w:rPr>
+          <w:lang w:val="en-ZA"/>
+        </w:rPr>
+      </w:pPr>
+      <w:proofErr w:type="gramStart"/>
+      <w:r>
+        <w:rPr>
+          <w:lang w:val="en-ZA"/>
+        </w:rPr>
+        <w:t>extract(</w:t>
+      </w:r>
+      <w:proofErr w:type="gramEnd"/>
+      <w:r>
+        <w:rPr>
+          <w:lang w:val="en-ZA"/>
+        </w:rPr>
+        <w:t>) – primitive operation</w:t>
+      </w:r>
+    </w:p>
+    <w:p>
+      <w:pPr>
+        <w:rPr>
+          <w:lang w:val="en-ZA"/>
+        </w:rPr>
+      </w:pPr>
+      <w:proofErr w:type="gramStart"/>
+      <w:r>
+        <w:rPr>
+          <w:lang w:val="en-ZA"/>
+        </w:rPr>
+        <w:t>transform(</w:t>
+      </w:r>
+      <w:proofErr w:type="gramEnd"/>
+      <w:r>
+        <w:rPr>
+          <w:lang w:val="en-ZA"/>
+        </w:rPr>
+        <w:t>) – concrete step</w:t>
+      </w:r>
+    </w:p>
+    <w:p>
+      <w:pPr>
+        <w:rPr>
+          <w:lang w:val="en-ZA"/>
+        </w:rPr>
+      </w:pPr>
+      <w:proofErr w:type="gramStart"/>
+      <w:r>
+        <w:rPr>
+          <w:lang w:val="en-ZA"/>
+        </w:rPr>
+        <w:t>load(</w:t>
+      </w:r>
+      <w:proofErr w:type="gramEnd"/>
+      <w:r>
+        <w:rPr>
+          <w:lang w:val="en-ZA"/>
+        </w:rPr>
+        <w:t>) – primitive operation</w:t>
+      </w:r>
+    </w:p>
+    <w:p>
+      <w:pPr>
+        <w:rPr>
+          <w:lang w:val="en-ZA"/>
+        </w:rPr>
+      </w:pPr>
+      <w:r>
+        <w:rPr>
+          <w:lang w:val="en-ZA"/>
+        </w:rPr>
+        <w:t xml:space="preserve">The Factory method created the connector object without the pipeline needing to know which concrete connector class is being used. The template method makes sure that all the pipeline objects follow the same logical sequence/algorithm. They do not overlap because they do not perform the same function. The template method manages the algorithm while the factory class manages object creation. </w:t>
+      </w:r>
+    </w:p>
+    <w:p>
+      <w:pPr>
+        <w:rPr>
+          <w:lang w:val="en-ZA"/>
+        </w:rPr>
+      </w:pPr>
+    </w:p>
+    <w:p>
+      <w:pPr>
+        <w:rPr>
+          <w:lang w:val="en-ZA"/>
+        </w:rPr>
+      </w:pPr>
+    </w:p>
+    <w:p>
+      <w:pPr>
+        <w:rPr>
+          <w:lang w:val="en-ZA"/>
+        </w:rPr>
+      </w:pPr>
       <w:r>
         <w:rPr>
           <w:lang w:val="en-ZA"/>
         </w:rPr>
         <w:lastRenderedPageBreak/>
-        <w:t>other pipeline would be affected. This could lead to issues such as dangling pointers and double deletion. Returning clones gives both pipelines their own separate copy to avoid these issues.</w:t>
-      </w:r>
-    </w:p>
-    <w:p>
-      <w:pPr>
-        <w:rPr>
-          <w:lang w:val="en-ZA"/>
-        </w:rPr>
-      </w:pPr>
-      <w:r>
-        <w:rPr>
-          <w:lang w:val="en-ZA"/>
-        </w:rPr>
-        <w:t xml:space="preserve">Task 3 </w:t>
-      </w:r>
-    </w:p>
-    <w:p>
-      <w:pPr>
-        <w:rPr>
-          <w:lang w:val="en-ZA"/>
-        </w:rPr>
-      </w:pPr>
-      <w:r>
-        <w:rPr>
-          <w:lang w:val="en-ZA"/>
-        </w:rPr>
-        <w:t>3.5</w:t>
-      </w:r>
-    </w:p>
-    <w:p>
-      <w:pPr>
-        <w:rPr>
-          <w:lang w:val="en-ZA"/>
-        </w:rPr>
-      </w:pPr>
-      <w:proofErr w:type="gramStart"/>
-      <w:r>
-        <w:rPr>
-          <w:lang w:val="en-ZA"/>
-        </w:rPr>
-        <w:t>run(</w:t>
-      </w:r>
-      <w:proofErr w:type="gramEnd"/>
-      <w:r>
-        <w:rPr>
-          <w:lang w:val="en-ZA"/>
-        </w:rPr>
-        <w:t>) is deliberately not virtual because it specifies the specific order in which connect(),extract(), transform() and load() should be executed in each subclass. If the subclasses could override it, this could lead to some of the functions not be executed at all or in the wrong order.</w:t>
-      </w:r>
-      <w:r>
+        <w:t>Task 4</w:t>
+      </w:r>
+    </w:p>
+    <w:p>
+      <w:pPr>
+        <w:rPr>
+          <w:lang w:val="en-ZA"/>
+        </w:rPr>
+      </w:pPr>
+      <w:r>
+        <w:rPr>
+          <w:lang w:val="en-ZA"/>
+        </w:rPr>
+        <w:t>4.4</w:t>
+      </w:r>
+    </w:p>
+    <w:p>
+      <w:pPr>
+        <w:rPr>
+          <w:b/>
+          <w:lang w:val="en-ZA"/>
+        </w:rPr>
+      </w:pPr>
+      <w:r>
+        <w:rPr>
+          <w:b/>
+          <w:lang w:val="en-ZA"/>
+        </w:rPr>
+        <w:t>Wide Interface</w:t>
+      </w:r>
+      <w:r>
+        <w:rPr>
+          <w:b/>
+          <w:lang w:val="en-ZA"/>
+        </w:rPr>
+        <w:t>: exists between originator</w:t>
+      </w:r>
+      <w:r>
+        <w:rPr>
+          <w:b/>
+          <w:lang w:val="en-ZA"/>
+        </w:rPr>
+        <w:t>(pipeline) and me</w:t>
+      </w:r>
+      <w:r>
+        <w:rPr>
+          <w:b/>
+          <w:lang w:val="en-ZA"/>
+        </w:rPr>
+        <w:t>mento</w:t>
+      </w:r>
+      <w:r>
+        <w:rPr>
+          <w:b/>
+          <w:lang w:val="en-ZA"/>
+        </w:rPr>
+        <w:t>(</w:t>
+      </w:r>
+      <w:proofErr w:type="spellStart"/>
+      <w:r>
+        <w:rPr>
+          <w:b/>
+          <w:lang w:val="en-ZA"/>
+        </w:rPr>
+        <w:t>RunCheckpoint</w:t>
+      </w:r>
+      <w:proofErr w:type="spellEnd"/>
+      <w:r>
+        <w:rPr>
+          <w:b/>
+          <w:lang w:val="en-ZA"/>
+        </w:rPr>
+        <w:t>)</w:t>
+      </w:r>
+    </w:p>
+    <w:p>
+      <w:pPr>
+        <w:rPr>
+          <w:lang w:val="en-ZA"/>
+        </w:rPr>
+      </w:pPr>
+      <w:r>
+        <w:rPr>
+          <w:lang w:val="en-ZA"/>
+        </w:rPr>
+        <w:t>The wide interface</w:t>
+      </w:r>
+      <w:r>
+        <w:rPr>
+          <w:lang w:val="en-ZA"/>
+        </w:rPr>
+        <w:t xml:space="preserve"> contains everything and</w:t>
+      </w:r>
+      <w:r>
+        <w:rPr>
+          <w:lang w:val="en-ZA"/>
+        </w:rPr>
         <w:t xml:space="preserve"> </w:t>
       </w:r>
       <w:r>
         <w:rPr>
           <w:lang w:val="en-ZA"/>
         </w:rPr>
-        <w:t xml:space="preserve">Making </w:t>
-      </w:r>
-      <w:proofErr w:type="gramStart"/>
-      <w:r>
-        <w:rPr>
-          <w:lang w:val="en-ZA"/>
-        </w:rPr>
-        <w:t>run(</w:t>
-      </w:r>
-      <w:proofErr w:type="gramEnd"/>
-      <w:r>
-        <w:rPr>
-          <w:lang w:val="en-ZA"/>
-        </w:rPr>
-        <w:t>) non-virtual guarantees that every pipeline follows the same processing sequence</w:t>
+        <w:t xml:space="preserve">exposes the full captured state. The wide interface allows reading, writing and restoring the state, hence only the </w:t>
+      </w:r>
+      <w:r>
+        <w:rPr>
+          <w:b/>
+          <w:lang w:val="en-ZA"/>
+        </w:rPr>
+        <w:t xml:space="preserve">Originator </w:t>
+      </w:r>
+      <w:r>
+        <w:rPr>
+          <w:lang w:val="en-ZA"/>
+        </w:rPr>
+        <w:t>can</w:t>
+      </w:r>
+      <w:r>
+        <w:rPr>
+          <w:b/>
+          <w:lang w:val="en-ZA"/>
+        </w:rPr>
+        <w:t xml:space="preserve"> </w:t>
+      </w:r>
+      <w:r>
+        <w:rPr>
+          <w:lang w:val="en-ZA"/>
+        </w:rPr>
+        <w:t>use it</w:t>
       </w:r>
       <w:r>
         <w:rPr>
@@ -851,228 +1270,11 @@
           <w:lang w:val="en-ZA"/>
         </w:rPr>
       </w:pPr>
-    </w:p>
-    <w:p>
-      <w:pPr>
-        <w:rPr>
-          <w:lang w:val="en-ZA"/>
-        </w:rPr>
-      </w:pPr>
-      <w:r>
-        <w:rPr>
-          <w:lang w:val="en-ZA"/>
-        </w:rPr>
-        <w:t>3.6</w:t>
-      </w:r>
-    </w:p>
-    <w:p>
-      <w:pPr>
-        <w:rPr>
-          <w:lang w:val="en-ZA"/>
-        </w:rPr>
-      </w:pPr>
-      <w:proofErr w:type="gramStart"/>
-      <w:r>
-        <w:rPr>
-          <w:lang w:val="en-ZA"/>
-        </w:rPr>
-        <w:t>run(</w:t>
-      </w:r>
-      <w:proofErr w:type="gramEnd"/>
-      <w:r>
-        <w:rPr>
-          <w:lang w:val="en-ZA"/>
-        </w:rPr>
-        <w:t>)- template method,</w:t>
-      </w:r>
-    </w:p>
-    <w:p>
-      <w:pPr>
-        <w:rPr>
-          <w:lang w:val="en-ZA"/>
-        </w:rPr>
-      </w:pPr>
-      <w:proofErr w:type="gramStart"/>
-      <w:r>
-        <w:rPr>
-          <w:lang w:val="en-ZA"/>
-        </w:rPr>
-        <w:t>connect(</w:t>
-      </w:r>
-      <w:proofErr w:type="gramEnd"/>
-      <w:r>
-        <w:rPr>
-          <w:lang w:val="en-ZA"/>
-        </w:rPr>
-        <w:t>)- concrete step</w:t>
-      </w:r>
-    </w:p>
-    <w:p>
-      <w:pPr>
-        <w:rPr>
-          <w:lang w:val="en-ZA"/>
-        </w:rPr>
-      </w:pPr>
-      <w:proofErr w:type="gramStart"/>
-      <w:r>
-        <w:rPr>
-          <w:lang w:val="en-ZA"/>
-        </w:rPr>
-        <w:t>extract(</w:t>
-      </w:r>
-      <w:proofErr w:type="gramEnd"/>
-      <w:r>
-        <w:rPr>
-          <w:lang w:val="en-ZA"/>
-        </w:rPr>
-        <w:t>) – primitive operation</w:t>
-      </w:r>
-    </w:p>
-    <w:p>
-      <w:pPr>
-        <w:rPr>
-          <w:lang w:val="en-ZA"/>
-        </w:rPr>
-      </w:pPr>
-      <w:proofErr w:type="gramStart"/>
-      <w:r>
-        <w:rPr>
-          <w:lang w:val="en-ZA"/>
-        </w:rPr>
-        <w:t>transform(</w:t>
-      </w:r>
-      <w:proofErr w:type="gramEnd"/>
-      <w:r>
-        <w:rPr>
-          <w:lang w:val="en-ZA"/>
-        </w:rPr>
-        <w:t>) – concrete step</w:t>
-      </w:r>
-    </w:p>
-    <w:p>
-      <w:pPr>
-        <w:rPr>
-          <w:lang w:val="en-ZA"/>
-        </w:rPr>
-      </w:pPr>
-      <w:proofErr w:type="gramStart"/>
-      <w:r>
-        <w:rPr>
-          <w:lang w:val="en-ZA"/>
-        </w:rPr>
-        <w:t>load(</w:t>
-      </w:r>
-      <w:proofErr w:type="gramEnd"/>
-      <w:r>
-        <w:rPr>
-          <w:lang w:val="en-ZA"/>
-        </w:rPr>
-        <w:t>) – primitive operation</w:t>
-      </w:r>
-    </w:p>
-    <w:p>
-      <w:pPr>
-        <w:rPr>
-          <w:lang w:val="en-ZA"/>
-        </w:rPr>
-      </w:pPr>
-      <w:r>
-        <w:rPr>
-          <w:lang w:val="en-ZA"/>
-        </w:rPr>
-        <w:t xml:space="preserve">The Factory method created the connector object without the pipeline needing to know which concrete connector class is being used. The template method makes sure that all the pipeline objects follow the same logical sequence/algorithm. They do not overlap because they do not perform the same function. The template method manages the algorithm while the factory class manages object creation. </w:t>
-      </w:r>
-    </w:p>
-    <w:p>
-      <w:pPr>
-        <w:rPr>
-          <w:lang w:val="en-ZA"/>
-        </w:rPr>
-      </w:pPr>
-    </w:p>
-    <w:p>
-      <w:pPr>
-        <w:rPr>
-          <w:lang w:val="en-ZA"/>
-        </w:rPr>
-      </w:pPr>
-      <w:r>
-        <w:rPr>
-          <w:lang w:val="en-ZA"/>
-        </w:rPr>
-        <w:t>Task 4</w:t>
-      </w:r>
-    </w:p>
-    <w:p>
-      <w:pPr>
-        <w:rPr>
-          <w:lang w:val="en-ZA"/>
-        </w:rPr>
-      </w:pPr>
-      <w:r>
-        <w:rPr>
-          <w:lang w:val="en-ZA"/>
-        </w:rPr>
-        <w:t>4.4</w:t>
-      </w:r>
-      <w:r>
-        <w:rPr>
-          <w:lang w:val="en-ZA"/>
-        </w:rPr>
-        <w:t>*********** INCOMPLETE*************</w:t>
-      </w:r>
-    </w:p>
-    <w:p>
-      <w:pPr>
-        <w:rPr>
-          <w:b/>
-          <w:lang w:val="en-ZA"/>
-        </w:rPr>
-      </w:pPr>
-      <w:r>
-        <w:rPr>
-          <w:b/>
-          <w:lang w:val="en-ZA"/>
-        </w:rPr>
-        <w:t>Wide Interface</w:t>
-      </w:r>
-    </w:p>
-    <w:p>
-      <w:pPr>
-        <w:rPr>
-          <w:lang w:val="en-ZA"/>
-        </w:rPr>
-      </w:pPr>
-      <w:r>
-        <w:rPr>
-          <w:lang w:val="en-ZA"/>
-        </w:rPr>
-        <w:t>The wide interface exposes the full captured state and i</w:t>
-      </w:r>
-      <w:r>
-        <w:rPr>
-          <w:lang w:val="en-ZA"/>
-        </w:rPr>
-        <w:t xml:space="preserve">s meant for the </w:t>
-      </w:r>
-      <w:r>
-        <w:rPr>
-          <w:b/>
-          <w:lang w:val="en-ZA"/>
-        </w:rPr>
-        <w:t xml:space="preserve">Originator </w:t>
-      </w:r>
-      <w:r>
-        <w:rPr>
-          <w:lang w:val="en-ZA"/>
-        </w:rPr>
-        <w:t>only.</w:t>
-      </w:r>
-      <w:r>
-        <w:rPr>
-          <w:lang w:val="en-ZA"/>
-        </w:rPr>
-        <w:t xml:space="preserve"> Pipeline is the only class that calls </w:t>
+      <w:r>
+        <w:rPr>
+          <w:lang w:val="en-ZA"/>
+        </w:rPr>
+        <w:t xml:space="preserve">Pipeline is the only class that calls </w:t>
       </w:r>
       <w:proofErr w:type="spellStart"/>
       <w:proofErr w:type="gramStart"/>
@@ -1125,7 +1327,51 @@
         <w:rPr>
           <w:lang w:val="en-ZA"/>
         </w:rPr>
-        <w:t xml:space="preserve"> since it is the only one that knows what that state means and how to use it, via </w:t>
+        <w:t xml:space="preserve"> - he</w:t>
+      </w:r>
+      <w:r>
+        <w:rPr>
+          <w:lang w:val="en-ZA"/>
+        </w:rPr>
+        <w:t>n</w:t>
+      </w:r>
+      <w:r>
+        <w:rPr>
+          <w:lang w:val="en-ZA"/>
+        </w:rPr>
+        <w:t>c</w:t>
+      </w:r>
+      <w:r>
+        <w:rPr>
+          <w:lang w:val="en-ZA"/>
+        </w:rPr>
+        <w:t>e</w:t>
+      </w:r>
+      <w:r>
+        <w:rPr>
+          <w:lang w:val="en-ZA"/>
+        </w:rPr>
+        <w:t xml:space="preserve"> it is the only one that knows what tha</w:t>
+      </w:r>
+      <w:r>
+        <w:rPr>
+          <w:lang w:val="en-ZA"/>
+        </w:rPr>
+        <w:t>t state contains</w:t>
+      </w:r>
+      <w:bookmarkStart w:id="0" w:name="_GoBack"/>
+      <w:bookmarkEnd w:id="0"/>
+      <w:r>
+        <w:rPr>
+          <w:lang w:val="en-ZA"/>
+        </w:rPr>
+        <w:t xml:space="preserve"> and how to use it(</w:t>
+      </w:r>
+      <w:r>
+        <w:rPr>
+          <w:lang w:val="en-ZA"/>
+        </w:rPr>
+        <w:t xml:space="preserve"> via </w:t>
       </w:r>
       <w:proofErr w:type="spellStart"/>
       <w:r>
@@ -1158,10 +1404,23 @@
       </w:r>
       <w:r>
         <w:rPr>
+          <w:i/>
+          <w:lang w:val="en-ZA"/>
+        </w:rPr>
+        <w:t>)</w:t>
+      </w:r>
+      <w:r>
+        <w:rPr>
           <w:lang w:val="en-ZA"/>
         </w:rPr>
         <w:t xml:space="preserve">. </w:t>
       </w:r>
+      <w:r>
+        <w:rPr>
+          <w:lang w:val="en-ZA"/>
+        </w:rPr>
+        <w:t>Pipeline- the originator- uses it.</w:t>
+      </w:r>
     </w:p>
     <w:p>
       <w:pPr>
@@ -1177,58 +1436,145 @@
         </w:rPr>
         <w:t>Narrow Interface</w:t>
       </w:r>
-    </w:p>
-    <w:p>
-      <w:pPr>
-        <w:rPr>
-          <w:lang w:val="en-ZA"/>
-        </w:rPr>
-      </w:pPr>
-      <w:r>
-        <w:rPr>
-          <w:lang w:val="en-ZA"/>
-        </w:rPr>
-        <w:t>The narrow interface is what everyone (</w:t>
-      </w:r>
       <w:r>
         <w:rPr>
           <w:b/>
           <w:lang w:val="en-ZA"/>
         </w:rPr>
-        <w:t>the C</w:t>
+        <w:t>: exists between memento</w:t>
       </w:r>
       <w:r>
         <w:rPr>
           <w:b/>
           <w:lang w:val="en-ZA"/>
         </w:rPr>
-        <w:t>aretaker</w:t>
-      </w:r>
-      <w:r>
-        <w:rPr>
-          <w:lang w:val="en-ZA"/>
-        </w:rPr>
-        <w:t>) is meant to see.</w:t>
-      </w:r>
-    </w:p>
-    <w:p>
-      <w:pPr>
-        <w:rPr>
-          <w:lang w:val="en-ZA"/>
-        </w:rPr>
-      </w:pPr>
-    </w:p>
-    <w:p>
-      <w:pPr>
-        <w:rPr>
-          <w:lang w:val="en-ZA"/>
-        </w:rPr>
-      </w:pPr>
-      <w:r>
-        <w:rPr>
-          <w:lang w:val="en-ZA"/>
-        </w:rPr>
-        <w:lastRenderedPageBreak/>
+        <w:t>(</w:t>
+      </w:r>
+      <w:proofErr w:type="spellStart"/>
+      <w:r>
+        <w:rPr>
+          <w:b/>
+          <w:lang w:val="en-ZA"/>
+        </w:rPr>
+        <w:t>RunCheckpoint</w:t>
+      </w:r>
+      <w:proofErr w:type="spellEnd"/>
+      <w:r>
+        <w:rPr>
+          <w:b/>
+          <w:lang w:val="en-ZA"/>
+        </w:rPr>
+        <w:t>)</w:t>
+      </w:r>
+      <w:r>
+        <w:rPr>
+          <w:b/>
+          <w:lang w:val="en-ZA"/>
+        </w:rPr>
+        <w:t xml:space="preserve"> and caretaker</w:t>
+      </w:r>
+      <w:r>
+        <w:rPr>
+          <w:b/>
+          <w:lang w:val="en-ZA"/>
+        </w:rPr>
+        <w:t>(</w:t>
+      </w:r>
+      <w:proofErr w:type="spellStart"/>
+      <w:r>
+        <w:rPr>
+          <w:b/>
+          <w:lang w:val="en-ZA"/>
+        </w:rPr>
+        <w:t>CheckpointManager</w:t>
+      </w:r>
+      <w:proofErr w:type="spellEnd"/>
+      <w:r>
+        <w:rPr>
+          <w:b/>
+          <w:lang w:val="en-ZA"/>
+        </w:rPr>
+        <w:t>)</w:t>
+      </w:r>
+    </w:p>
+    <w:p>
+      <w:pPr>
+        <w:rPr>
+          <w:lang w:val="en-ZA"/>
+        </w:rPr>
+      </w:pPr>
+      <w:r>
+        <w:rPr>
+          <w:lang w:val="en-ZA"/>
+        </w:rPr>
+        <w:t xml:space="preserve">The narrow interface </w:t>
+      </w:r>
+      <w:r>
+        <w:rPr>
+          <w:lang w:val="en-ZA"/>
+        </w:rPr>
+        <w:t xml:space="preserve">does not expose the internal state hence it is used by the </w:t>
+      </w:r>
+      <w:r>
+        <w:rPr>
+          <w:b/>
+          <w:lang w:val="en-ZA"/>
+        </w:rPr>
+        <w:t>Caretaker</w:t>
+      </w:r>
+      <w:r>
+        <w:rPr>
+          <w:b/>
+          <w:lang w:val="en-ZA"/>
+        </w:rPr>
+        <w:t>(</w:t>
+      </w:r>
+      <w:proofErr w:type="spellStart"/>
+      <w:r>
+        <w:rPr>
+          <w:b/>
+          <w:lang w:val="en-ZA"/>
+        </w:rPr>
+        <w:t>CheckpointManager</w:t>
+      </w:r>
+      <w:proofErr w:type="spellEnd"/>
+      <w:r>
+        <w:rPr>
+          <w:b/>
+          <w:lang w:val="en-ZA"/>
+        </w:rPr>
+        <w:t>)</w:t>
+      </w:r>
+      <w:r>
+        <w:rPr>
+          <w:lang w:val="en-ZA"/>
+        </w:rPr>
+        <w:t>. The caretaker only needs to store the memento</w:t>
+      </w:r>
+      <w:r>
+        <w:rPr>
+          <w:lang w:val="en-ZA"/>
+        </w:rPr>
+        <w:t>, return it later on and delete if necessary.</w:t>
+      </w:r>
+    </w:p>
+    <w:p>
+      <w:pPr>
+        <w:rPr>
+          <w:lang w:val="en-ZA"/>
+        </w:rPr>
+      </w:pPr>
+    </w:p>
+    <w:p>
+      <w:pPr>
+        <w:rPr>
+          <w:lang w:val="en-ZA"/>
+        </w:rPr>
+      </w:pPr>
+      <w:r>
+        <w:rPr>
+          <w:lang w:val="en-ZA"/>
+        </w:rPr>
         <w:t>4.5</w:t>
       </w:r>
     </w:p>
@@ -1252,18 +1598,23 @@
       <w:proofErr w:type="gramStart"/>
       <w:r>
         <w:rPr>
+          <w:lang w:val="en-ZA"/>
+        </w:rPr>
+        <w:t>transform(</w:t>
+      </w:r>
+      <w:proofErr w:type="gramEnd"/>
+      <w:r>
+        <w:rPr>
+          <w:lang w:val="en-ZA"/>
+        </w:rPr>
+        <w:t>)</w:t>
+      </w:r>
+      <w:r>
+        <w:rPr>
           <w:i/>
           <w:lang w:val="en-ZA"/>
         </w:rPr>
-        <w:t>transform(</w:t>
-      </w:r>
-      <w:proofErr w:type="gramEnd"/>
-      <w:r>
-        <w:rPr>
-          <w:i/>
-          <w:lang w:val="en-ZA"/>
-        </w:rPr>
-        <w:t xml:space="preserve">) </w:t>
+        <w:t xml:space="preserve"> </w:t>
       </w:r>
       <w:r>
         <w:rPr>
@@ -1274,7 +1625,7 @@
       <w:proofErr w:type="spellStart"/>
       <w:r>
         <w:rPr>
-          <w:i/>
+          <w:b/>
           <w:lang w:val="en-ZA"/>
         </w:rPr>
         <w:t>createCheckpoint</w:t>
@@ -1282,30 +1633,10 @@
       <w:proofErr w:type="spellEnd"/>
       <w:r>
         <w:rPr>
-          <w:i/>
-          <w:lang w:val="en-ZA"/>
-        </w:rPr>
-        <w:t>(),</w:t>
-      </w:r>
-      <w:r>
-        <w:rPr>
-          <w:lang w:val="en-ZA"/>
-        </w:rPr>
-        <w:t xml:space="preserve"> which packages its current stage and records into a new </w:t>
-      </w:r>
-      <w:proofErr w:type="spellStart"/>
-      <w:r>
-        <w:rPr>
-          <w:lang w:val="en-ZA"/>
-        </w:rPr>
-        <w:t>RunCheckpoint</w:t>
-      </w:r>
-      <w:proofErr w:type="spellEnd"/>
-      <w:r>
-        <w:rPr>
-          <w:lang w:val="en-ZA"/>
-        </w:rPr>
-        <w:t>.</w:t>
+          <w:b/>
+          <w:lang w:val="en-ZA"/>
+        </w:rPr>
+        <w:t>()</w:t>
       </w:r>
     </w:p>
     <w:p>
@@ -1319,33 +1650,59 @@
           <w:lang w:val="en-ZA"/>
         </w:rPr>
       </w:pPr>
-      <w:r>
-        <w:rPr>
-          <w:lang w:val="en-ZA"/>
-        </w:rPr>
-        <w:t xml:space="preserve">That checkpoint it then passed to </w:t>
-      </w:r>
       <w:proofErr w:type="spellStart"/>
       <w:proofErr w:type="gramStart"/>
       <w:r>
         <w:rPr>
           <w:lang w:val="en-ZA"/>
         </w:rPr>
-        <w:t>CheckpointManager</w:t>
+        <w:t>createCheckpoint</w:t>
       </w:r>
       <w:proofErr w:type="spellEnd"/>
       <w:r>
         <w:rPr>
           <w:lang w:val="en-ZA"/>
         </w:rPr>
-        <w:t>::</w:t>
+        <w:t>(</w:t>
       </w:r>
       <w:proofErr w:type="gramEnd"/>
       <w:r>
         <w:rPr>
           <w:lang w:val="en-ZA"/>
         </w:rPr>
-        <w:t>save(), which appends it to its history.</w:t>
+        <w:t>)</w:t>
+      </w:r>
+      <w:r>
+        <w:rPr>
+          <w:lang w:val="en-ZA"/>
+        </w:rPr>
+        <w:t xml:space="preserve"> </w:t>
+      </w:r>
+      <w:r>
+        <w:rPr>
+          <w:lang w:val="en-ZA"/>
+        </w:rPr>
+        <w:t xml:space="preserve">then </w:t>
+      </w:r>
+      <w:r>
+        <w:rPr>
+          <w:lang w:val="en-ZA"/>
+        </w:rPr>
+        <w:t xml:space="preserve">creates a </w:t>
+      </w:r>
+      <w:proofErr w:type="spellStart"/>
+      <w:r>
+        <w:rPr>
+          <w:lang w:val="en-ZA"/>
+        </w:rPr>
+        <w:t>RunCheckpoint</w:t>
+      </w:r>
+      <w:proofErr w:type="spellEnd"/>
+      <w:r>
+        <w:rPr>
+          <w:lang w:val="en-ZA"/>
+        </w:rPr>
+        <w:t xml:space="preserve"> (Memento) containing the Pipeline's current stage and records.</w:t>
       </w:r>
     </w:p>
     <w:p>
@@ -1359,27 +1716,39 @@
           <w:lang w:val="en-ZA"/>
         </w:rPr>
       </w:pPr>
-      <w:proofErr w:type="gramStart"/>
-      <w:r>
-        <w:rPr>
-          <w:i/>
-          <w:lang w:val="en-ZA"/>
-        </w:rPr>
-        <w:t>load(</w:t>
-      </w:r>
-      <w:proofErr w:type="gramEnd"/>
-      <w:r>
-        <w:rPr>
-          <w:i/>
-          <w:lang w:val="en-ZA"/>
-        </w:rPr>
-        <w:t xml:space="preserve">) </w:t>
-      </w:r>
-      <w:r>
-        <w:rPr>
-          <w:lang w:val="en-ZA"/>
-        </w:rPr>
-        <w:t>runs next and hypothetically the program crashes at 02:00 before it completes.</w:t>
+      <w:r>
+        <w:rPr>
+          <w:lang w:val="en-ZA"/>
+        </w:rPr>
+        <w:t xml:space="preserve">The Pipeline passes the newly created </w:t>
+      </w:r>
+      <w:proofErr w:type="spellStart"/>
+      <w:r>
+        <w:rPr>
+          <w:lang w:val="en-ZA"/>
+        </w:rPr>
+        <w:t>RunCheckpoint</w:t>
+      </w:r>
+      <w:proofErr w:type="spellEnd"/>
+      <w:r>
+        <w:rPr>
+          <w:lang w:val="en-ZA"/>
+        </w:rPr>
+        <w:t xml:space="preserve"> to the </w:t>
+      </w:r>
+      <w:proofErr w:type="spellStart"/>
+      <w:r>
+        <w:rPr>
+          <w:lang w:val="en-ZA"/>
+        </w:rPr>
+        <w:t>CheckpointManager</w:t>
+      </w:r>
+      <w:proofErr w:type="spellEnd"/>
+      <w:r>
+        <w:rPr>
+          <w:lang w:val="en-ZA"/>
+        </w:rPr>
+        <w:t xml:space="preserve"> (Caretaker).</w:t>
       </w:r>
     </w:p>
     <w:p>
@@ -1397,7 +1766,34 @@
         <w:rPr>
           <w:lang w:val="en-ZA"/>
         </w:rPr>
-        <w:t>Upon restart a new pipeline object will be constructed with the same type of factory as the failed run.</w:t>
+        <w:t xml:space="preserve">The </w:t>
+      </w:r>
+      <w:proofErr w:type="spellStart"/>
+      <w:r>
+        <w:rPr>
+          <w:lang w:val="en-ZA"/>
+        </w:rPr>
+        <w:t>CheckpointManager</w:t>
+      </w:r>
+      <w:proofErr w:type="spellEnd"/>
+      <w:r>
+        <w:rPr>
+          <w:lang w:val="en-ZA"/>
+        </w:rPr>
+        <w:t xml:space="preserve"> stores the checkpoint by calling </w:t>
+      </w:r>
+      <w:r>
+        <w:rPr>
+          <w:b/>
+          <w:lang w:val="en-ZA"/>
+        </w:rPr>
+        <w:t>save(checkpoint)</w:t>
+      </w:r>
+      <w:r>
+        <w:rPr>
+          <w:lang w:val="en-ZA"/>
+        </w:rPr>
+        <w:t>, which appends it to its list of saved checkpoints.</w:t>
       </w:r>
     </w:p>
     <w:p>
@@ -1411,41 +1807,38 @@
           <w:lang w:val="en-ZA"/>
         </w:rPr>
       </w:pPr>
-      <w:proofErr w:type="spellStart"/>
       <w:proofErr w:type="gramStart"/>
       <w:r>
         <w:rPr>
           <w:lang w:val="en-ZA"/>
         </w:rPr>
-        <w:t>CheckpointManager</w:t>
-      </w:r>
-      <w:proofErr w:type="spellEnd"/>
-      <w:r>
-        <w:rPr>
-          <w:lang w:val="en-ZA"/>
-        </w:rPr>
-        <w:t>::</w:t>
+        <w:t>load(</w:t>
       </w:r>
       <w:proofErr w:type="gramEnd"/>
       <w:r>
         <w:rPr>
           <w:lang w:val="en-ZA"/>
         </w:rPr>
-        <w:t xml:space="preserve">undo() is called, popping and returning the most recently saved </w:t>
-      </w:r>
-      <w:proofErr w:type="spellStart"/>
-      <w:r>
-        <w:rPr>
-          <w:lang w:val="en-ZA"/>
-        </w:rPr>
-        <w:t>RunCheckpoint</w:t>
-      </w:r>
-      <w:proofErr w:type="spellEnd"/>
-      <w:r>
-        <w:rPr>
-          <w:lang w:val="en-ZA"/>
-        </w:rPr>
-        <w:t>.</w:t>
+        <w:t>)</w:t>
+      </w:r>
+      <w:r>
+        <w:rPr>
+          <w:i/>
+          <w:lang w:val="en-ZA"/>
+        </w:rPr>
+        <w:t xml:space="preserve"> </w:t>
+      </w:r>
+      <w:r>
+        <w:rPr>
+          <w:lang w:val="en-ZA"/>
+        </w:rPr>
+        <w:t>runs next and</w:t>
+      </w:r>
+      <w:r>
+        <w:rPr>
+          <w:lang w:val="en-ZA"/>
+        </w:rPr>
+        <w:t xml:space="preserve"> the program crashes at 02:00 before it completes.</w:t>
       </w:r>
     </w:p>
     <w:p>
@@ -1463,42 +1856,7 @@
         <w:rPr>
           <w:lang w:val="en-ZA"/>
         </w:rPr>
-        <w:t xml:space="preserve">The new pipeline calls restore(checkpoint), which sets its stage and records back to exactly where the previous successful checkpoint left off (after </w:t>
-      </w:r>
-      <w:proofErr w:type="gramStart"/>
-      <w:r>
-        <w:rPr>
-          <w:color w:val="215E99" w:themeColor="text2" w:themeTint="BF"/>
-          <w:lang w:val="en-ZA"/>
-        </w:rPr>
-        <w:t>transform(</w:t>
-      </w:r>
-      <w:proofErr w:type="gramEnd"/>
-      <w:r>
-        <w:rPr>
-          <w:color w:val="215E99" w:themeColor="text2" w:themeTint="BF"/>
-          <w:lang w:val="en-ZA"/>
-        </w:rPr>
-        <w:t>)</w:t>
-      </w:r>
-      <w:r>
-        <w:rPr>
-          <w:lang w:val="en-ZA"/>
-        </w:rPr>
-        <w:t xml:space="preserve"> and before </w:t>
-      </w:r>
-      <w:r>
-        <w:rPr>
-          <w:color w:val="215E99" w:themeColor="text2" w:themeTint="BF"/>
-          <w:lang w:val="en-ZA"/>
-        </w:rPr>
-        <w:t>load()</w:t>
-      </w:r>
-      <w:r>
-        <w:rPr>
-          <w:lang w:val="en-ZA"/>
-        </w:rPr>
-        <w:t>)</w:t>
+        <w:t>Upon restart a new pipeline object will be constructed with the same type of factory as the failed run.</w:t>
       </w:r>
     </w:p>
     <w:p>
@@ -1516,11 +1874,26 @@
         <w:rPr>
           <w:lang w:val="en-ZA"/>
         </w:rPr>
-        <w:t xml:space="preserve">The checkpoint is deleted once its ownership has passed out of </w:t>
+        <w:t xml:space="preserve">To recover, the program asks the </w:t>
+      </w:r>
+      <w:proofErr w:type="spellStart"/>
+      <w:r>
+        <w:rPr>
+          <w:lang w:val="en-ZA"/>
+        </w:rPr>
+        <w:t>CheckpointManager</w:t>
+      </w:r>
+      <w:proofErr w:type="spellEnd"/>
+      <w:r>
+        <w:rPr>
+          <w:lang w:val="en-ZA"/>
+        </w:rPr>
+        <w:t xml:space="preserve"> for the most recent checkpoint by calling </w:t>
       </w:r>
       <w:proofErr w:type="gramStart"/>
       <w:r>
         <w:rPr>
+          <w:b/>
           <w:lang w:val="en-ZA"/>
         </w:rPr>
         <w:t>undo(</w:t>
@@ -1528,6 +1901,187 @@
       <w:proofErr w:type="gramEnd"/>
       <w:r>
         <w:rPr>
+          <w:b/>
+          <w:lang w:val="en-ZA"/>
+        </w:rPr>
+        <w:t>).</w:t>
+      </w:r>
+    </w:p>
+    <w:p>
+      <w:pPr>
+        <w:pStyle w:val="ListParagraph"/>
+        <w:numPr>
+          <w:ilvl w:val="0"/>
+          <w:numId w:val="1"/>
+        </w:numPr>
+        <w:rPr>
+          <w:lang w:val="en-ZA"/>
+        </w:rPr>
+      </w:pPr>
+      <w:proofErr w:type="gramStart"/>
+      <w:r>
+        <w:rPr>
+          <w:b/>
+          <w:lang w:val="en-ZA"/>
+        </w:rPr>
+        <w:t>undo(</w:t>
+      </w:r>
+      <w:proofErr w:type="gramEnd"/>
+      <w:r>
+        <w:rPr>
+          <w:b/>
+          <w:lang w:val="en-ZA"/>
+        </w:rPr>
+        <w:t>)</w:t>
+      </w:r>
+      <w:r>
+        <w:rPr>
+          <w:lang w:val="en-ZA"/>
+        </w:rPr>
+        <w:t xml:space="preserve"> is called, popping and re</w:t>
+      </w:r>
+      <w:r>
+        <w:rPr>
+          <w:lang w:val="en-ZA"/>
+        </w:rPr>
+        <w:t xml:space="preserve">turning the most recently saved </w:t>
+      </w:r>
+      <w:proofErr w:type="spellStart"/>
+      <w:r>
+        <w:rPr>
+          <w:lang w:val="en-ZA"/>
+        </w:rPr>
+        <w:t>RunCheckpoint</w:t>
+      </w:r>
+      <w:proofErr w:type="spellEnd"/>
+      <w:r>
+        <w:rPr>
+          <w:lang w:val="en-ZA"/>
+        </w:rPr>
+        <w:t>.</w:t>
+      </w:r>
+    </w:p>
+    <w:p>
+      <w:pPr>
+        <w:pStyle w:val="ListParagraph"/>
+        <w:numPr>
+          <w:ilvl w:val="0"/>
+          <w:numId w:val="1"/>
+        </w:numPr>
+        <w:rPr>
+          <w:lang w:val="en-ZA"/>
+        </w:rPr>
+      </w:pPr>
+      <w:r>
+        <w:rPr>
+          <w:lang w:val="en-ZA"/>
+        </w:rPr>
+        <w:t>The returned checkpoint is passed back to the Pipeline.</w:t>
+      </w:r>
+    </w:p>
+    <w:p>
+      <w:pPr>
+        <w:pStyle w:val="ListParagraph"/>
+        <w:numPr>
+          <w:ilvl w:val="0"/>
+          <w:numId w:val="1"/>
+        </w:numPr>
+        <w:rPr>
+          <w:lang w:val="en-ZA"/>
+        </w:rPr>
+      </w:pPr>
+      <w:r>
+        <w:rPr>
+          <w:lang w:val="en-ZA"/>
+        </w:rPr>
+        <w:t xml:space="preserve">The new pipeline calls </w:t>
+      </w:r>
+      <w:r>
+        <w:rPr>
+          <w:b/>
+          <w:lang w:val="en-ZA"/>
+        </w:rPr>
+        <w:t>restore(checkpoint</w:t>
+      </w:r>
+      <w:r>
+        <w:rPr>
+          <w:b/>
+          <w:lang w:val="en-ZA"/>
+        </w:rPr>
+        <w:t>)</w:t>
+      </w:r>
+      <w:r>
+        <w:rPr>
+          <w:lang w:val="en-ZA"/>
+        </w:rPr>
+        <w:t xml:space="preserve">, which sets its stage and records back to exactly where the previous successful checkpoint left off (after </w:t>
+      </w:r>
+      <w:proofErr w:type="gramStart"/>
+      <w:r>
+        <w:rPr>
+          <w:lang w:val="en-ZA"/>
+        </w:rPr>
+        <w:t>transform(</w:t>
+      </w:r>
+      <w:proofErr w:type="gramEnd"/>
+      <w:r>
+        <w:rPr>
+          <w:lang w:val="en-ZA"/>
+        </w:rPr>
+        <w:t xml:space="preserve">) </w:t>
+      </w:r>
+      <w:r>
+        <w:rPr>
+          <w:lang w:val="en-ZA"/>
+        </w:rPr>
+        <w:t xml:space="preserve">and before </w:t>
+      </w:r>
+      <w:r>
+        <w:rPr>
+          <w:lang w:val="en-ZA"/>
+        </w:rPr>
+        <w:t>load())</w:t>
+      </w:r>
+    </w:p>
+    <w:p>
+      <w:pPr>
+        <w:pStyle w:val="ListParagraph"/>
+        <w:numPr>
+          <w:ilvl w:val="0"/>
+          <w:numId w:val="1"/>
+        </w:numPr>
+        <w:rPr>
+          <w:lang w:val="en-ZA"/>
+        </w:rPr>
+      </w:pPr>
+      <w:r>
+        <w:rPr>
+          <w:lang w:val="en-ZA"/>
+        </w:rPr>
+        <w:t>The checkpoi</w:t>
+      </w:r>
+      <w:r>
+        <w:rPr>
+          <w:lang w:val="en-ZA"/>
+        </w:rPr>
+        <w:t>nt is deleted once it</w:t>
+      </w:r>
+      <w:r>
+        <w:rPr>
+          <w:lang w:val="en-ZA"/>
+        </w:rPr>
+        <w:t xml:space="preserve"> has passed out of </w:t>
+      </w:r>
+      <w:proofErr w:type="gramStart"/>
+      <w:r>
+        <w:rPr>
+          <w:lang w:val="en-ZA"/>
+        </w:rPr>
+        <w:t>undo(</w:t>
+      </w:r>
+      <w:proofErr w:type="gramEnd"/>
+      <w:r>
+        <w:rPr>
           <w:lang w:val="en-ZA"/>
         </w:rPr>
         <w:t xml:space="preserve">), and the run resumes from load() instead of </w:t>
@@ -1536,19 +2090,38 @@
         <w:rPr>
           <w:lang w:val="en-ZA"/>
         </w:rPr>
-        <w:t>rerunning connect(), extract(), and transform() from scratch.</w:t>
-      </w:r>
-    </w:p>
-    <w:p>
-      <w:pPr>
-        <w:rPr>
-          <w:lang w:val="en-ZA"/>
-        </w:rPr>
-      </w:pPr>
-      <w:r>
-        <w:rPr>
-          <w:lang w:val="en-ZA"/>
-        </w:rPr>
+        <w:t>starting the entire run again(</w:t>
+      </w:r>
+      <w:r>
+        <w:rPr>
+          <w:lang w:val="en-ZA"/>
+        </w:rPr>
+        <w:t>rerunning connect(), extract(), and transform() from scratch</w:t>
+      </w:r>
+      <w:r>
+        <w:rPr>
+          <w:lang w:val="en-ZA"/>
+        </w:rPr>
+        <w:t>)</w:t>
+      </w:r>
+      <w:r>
+        <w:rPr>
+          <w:lang w:val="en-ZA"/>
+        </w:rPr>
+        <w:t>.</w:t>
+      </w:r>
+    </w:p>
+    <w:p>
+      <w:pPr>
+        <w:rPr>
+          <w:lang w:val="en-ZA"/>
+        </w:rPr>
+      </w:pPr>
+      <w:r>
+        <w:rPr>
+          <w:lang w:val="en-ZA"/>
+        </w:rPr>
+        <w:lastRenderedPageBreak/>
         <w:t>4.6</w:t>
       </w:r>
     </w:p>
@@ -1574,6 +2147,12 @@
                 <w:lang w:val="en-ZA"/>
               </w:rPr>
             </w:pPr>
+            <w:r>
+              <w:rPr>
+                <w:lang w:val="en-ZA"/>
+              </w:rPr>
+              <w:t>Class</w:t>
+            </w:r>
           </w:p>
         </w:tc>
         <w:tc>
@@ -1608,7 +2187,7 @@
               <w:rPr>
                 <w:lang w:val="en-ZA"/>
               </w:rPr>
-              <w:t>Purpose</w:t>
+              <w:t>Reason</w:t>
             </w:r>
           </w:p>
         </w:tc>
@@ -1657,6 +2236,7 @@
           <w:p>
             <w:pPr>
               <w:rPr>
+                <w:i/>
                 <w:lang w:val="en-ZA"/>
               </w:rPr>
             </w:pPr>
@@ -1664,7 +2244,42 @@
               <w:rPr>
                 <w:lang w:val="en-ZA"/>
               </w:rPr>
-              <w:t>Object with meaningful state, capable of creating and restoring its own snapshots</w:t>
+              <w:t xml:space="preserve">It creates checkpoints of its own state uses </w:t>
+            </w:r>
+            <w:proofErr w:type="spellStart"/>
+            <w:r>
+              <w:rPr>
+                <w:i/>
+                <w:lang w:val="en-ZA"/>
+              </w:rPr>
+              <w:t>createCheckpoint</w:t>
+            </w:r>
+            <w:proofErr w:type="spellEnd"/>
+            <w:r>
+              <w:rPr>
+                <w:i/>
+                <w:lang w:val="en-ZA"/>
+              </w:rPr>
+              <w:t xml:space="preserve">() </w:t>
+            </w:r>
+            <w:r>
+              <w:rPr>
+                <w:lang w:val="en-ZA"/>
+              </w:rPr>
+              <w:t>and restores its</w:t>
+            </w:r>
+            <w:r>
+              <w:rPr>
+                <w:lang w:val="en-ZA"/>
+              </w:rPr>
+              <w:t xml:space="preserve"> sate using </w:t>
+            </w:r>
+            <w:r>
+              <w:rPr>
+                <w:i/>
+                <w:lang w:val="en-ZA"/>
+              </w:rPr>
+              <w:t>restore().</w:t>
             </w:r>
           </w:p>
         </w:tc>
@@ -1722,7 +2337,7 @@
               <w:rPr>
                 <w:lang w:val="en-ZA"/>
               </w:rPr>
-              <w:t>Snapshot holding stage and records</w:t>
+              <w:t>It stores the Pipeline’s saved state (stage and records)</w:t>
             </w:r>
           </w:p>
         </w:tc>
@@ -1780,15 +2395,21 @@
               <w:rPr>
                 <w:lang w:val="en-ZA"/>
               </w:rPr>
-              <w:t>Stores and hands back memento without viewing or modifying contents- related by aggregation</w:t>
-            </w:r>
-            <w:bookmarkStart w:id="0" w:name="_GoBack"/>
-            <w:bookmarkEnd w:id="0"/>
-            <w:r>
-              <w:rPr>
-                <w:lang w:val="en-ZA"/>
-              </w:rPr>
-              <w:t xml:space="preserve"> not ownership.</w:t>
+              <w:t xml:space="preserve">It stores, manages and returns </w:t>
+            </w:r>
+            <w:proofErr w:type="spellStart"/>
+            <w:r>
+              <w:rPr>
+                <w:lang w:val="en-ZA"/>
+              </w:rPr>
+              <w:t>RunCheckpoint</w:t>
+            </w:r>
+            <w:proofErr w:type="spellEnd"/>
+            <w:r>
+              <w:rPr>
+                <w:lang w:val="en-ZA"/>
+              </w:rPr>
+              <w:t xml:space="preserve"> (the memento) objects without examining or modifying the contents.</w:t>
             </w:r>
           </w:p>
         </w:tc>

</xml_diff>